<commit_message>
Ajuste de CFA y Video
</commit_message>
<xml_diff>
--- a/fuentes/621602_CF01_DU.docx
+++ b/fuentes/621602_CF01_DU.docx
@@ -2486,14 +2486,11 @@
         <w:jc w:val="center"/>
       </w:pPr>
       <w:r>
-        <w:rPr>
-          <w:noProof/>
-        </w:rPr>
         <w:drawing>
-          <wp:inline distT="0" distB="0" distL="0" distR="0" wp14:anchorId="4E9C15DF" wp14:editId="4E12A26C">
-            <wp:extent cx="4680000" cy="2620800"/>
-            <wp:effectExtent l="0" t="0" r="6350" b="8255"/>
-            <wp:docPr id="4" name="Imagen 4">
+          <wp:inline distT="0" distB="0" distL="0" distR="0" wp14:anchorId="4504A237" wp14:editId="757772A6">
+            <wp:extent cx="4680000" cy="2491200"/>
+            <wp:effectExtent l="0" t="0" r="6350" b="4445"/>
+            <wp:docPr id="5" name="Imagen 5">
               <a:extLst xmlns:a="http://schemas.openxmlformats.org/drawingml/2006/main">
                 <a:ext uri="{C183D7F6-B498-43B3-948B-1728B52AA6E4}">
                   <adec:decorative xmlns:adec="http://schemas.microsoft.com/office/drawing/2017/decorative" val="1"/>
@@ -2507,7 +2504,7 @@
               <a:graphicData uri="http://schemas.openxmlformats.org/drawingml/2006/picture">
                 <pic:pic xmlns:pic="http://schemas.openxmlformats.org/drawingml/2006/picture">
                   <pic:nvPicPr>
-                    <pic:cNvPr id="4" name="Imagen 4">
+                    <pic:cNvPr id="5" name="Imagen 5">
                       <a:extLst>
                         <a:ext uri="{C183D7F6-B498-43B3-948B-1728B52AA6E4}">
                           <adec:decorative xmlns:adec="http://schemas.microsoft.com/office/drawing/2017/decorative" val="1"/>
@@ -2525,7 +2522,7 @@
                   <pic:spPr>
                     <a:xfrm>
                       <a:off x="0" y="0"/>
-                      <a:ext cx="4680000" cy="2620800"/>
+                      <a:ext cx="4680000" cy="2491200"/>
                     </a:xfrm>
                     <a:prstGeom prst="rect">
                       <a:avLst/>
@@ -2607,15 +2604,12 @@
           </w:p>
           <w:p>
             <w:r>
-              <w:t xml:space="preserve">Después de la caída del Imperio Romano, hasta los siglos X y XI, el servicio de hospedaje pasó a manos de los monasterios, que prestaban este servicio por caridad. </w:t>
-            </w:r>
+              <w:t xml:space="preserve">Después de la caída del Imperio Romano, hasta los siglos X y XI, el servicio de hospedaje pasó a manos de los monasterios, que prestaban este servicio por caridad. La hospitalidad se volvió un servicio voluntario y estaba protegido por la ley. También estaban los sitios donde se prestaba este servicio a cambio de un valor. </w:t>
+            </w:r>
+          </w:p>
+          <w:p>
             <w:r>
               <w:lastRenderedPageBreak/>
-              <w:t xml:space="preserve">La hospitalidad se volvió un servicio voluntario y estaba protegido por la ley. También estaban los sitios donde se prestaba este servicio a cambio de un valor. </w:t>
-            </w:r>
-          </w:p>
-          <w:p>
-            <w:r>
               <w:t>A partir del siglo XI</w:t>
             </w:r>
             <w:r>
@@ -2653,11 +2647,11 @@
           </w:p>
           <w:p>
             <w:r>
-              <w:t xml:space="preserve">A mediados de 1800 aparecen los hoteles de propiedad corporativa. El famoso Ritz y su cadena de hoteles se inauguró en 1880 y el modelo de negocio se extiende </w:t>
+              <w:t xml:space="preserve">A mediados de 1800 aparecen los hoteles de propiedad corporativa. El famoso Ritz y su cadena de hoteles se inauguró en 1880 y el modelo de negocio se extiende de Europa a Estados Unidos tras 1900. Francia fue el gran referente en la industria </w:t>
             </w:r>
             <w:r>
               <w:lastRenderedPageBreak/>
-              <w:t>de Europa a Estados Unidos tras 1900. Francia fue el gran referente en la industria hotelera desde mediados del siglo XIX, hasta que a finales del siglo XX Estados Unidos tomó el relevo con sus grandes cadenas hoteleras y gigantes establecimientos.</w:t>
+              <w:t>hotelera desde mediados del siglo XIX, hasta que a finales del siglo XX Estados Unidos tomó el relevo con sus grandes cadenas hoteleras y gigantes establecimientos.</w:t>
             </w:r>
           </w:p>
           <w:p>
@@ -2687,11 +2681,11 @@
     </w:p>
     <w:p>
       <w:r>
-        <w:t xml:space="preserve">Desde una perspectiva técnico profesional, la normativa hotelera proporciona el marco de actuación dentro del cual se desarrollan los procesos operativos, administrativos y de servicio. El conocimiento y la correcta aplicación de estas disposiciones permiten al talento humano comprender las condiciones bajo las cuales opera el establecimiento, identificar responsabilidades y participar activamente en el </w:t>
+        <w:t xml:space="preserve">Desde una perspectiva técnico profesional, la normativa hotelera proporciona el marco de actuación dentro del cual se desarrollan los procesos operativos, administrativos y de servicio. El conocimiento y la correcta aplicación de estas disposiciones permiten al talento humano comprender las condiciones bajo las cuales opera el establecimiento, identificar responsabilidades y participar activamente en el cumplimiento de los procedimientos técnicos y los protocolos establecidos. Asimismo, </w:t>
       </w:r>
       <w:r>
         <w:lastRenderedPageBreak/>
-        <w:t>cumplimiento de los procedimientos técnicos y los protocolos establecidos. Asimismo, la normativa orienta la estandarización de los servicios y contribuye a la mejora continua de la calidad en la atención al huésped.</w:t>
+        <w:t>la normativa orienta la estandarización de los servicios y contribuye a la mejora continua de la calidad en la atención al huésped.</w:t>
       </w:r>
     </w:p>
     <w:p>
@@ -2737,7 +2731,7 @@
           <w:lang w:eastAsia="es-CO"/>
         </w:rPr>
         <w:drawing>
-          <wp:inline distT="0" distB="0" distL="0" distR="0" wp14:anchorId="3FDCDE88" wp14:editId="0A359380">
+          <wp:inline distT="0" distB="0" distL="0" distR="0" wp14:anchorId="3FDCDE88" wp14:editId="3B649F78">
             <wp:extent cx="4680000" cy="2631600"/>
             <wp:effectExtent l="0" t="0" r="6350" b="0"/>
             <wp:docPr id="12" name="Imagen 12" descr="La figura 1 enuncia los aspectos sobre los cuales dicta disposiciones la Ley 300 de 1996."/>
@@ -3873,7 +3867,7 @@
           <w:noProof/>
         </w:rPr>
         <w:drawing>
-          <wp:inline distT="0" distB="0" distL="0" distR="0" wp14:anchorId="275D6123" wp14:editId="5F0F05BB">
+          <wp:inline distT="0" distB="0" distL="0" distR="0" wp14:anchorId="275D6123" wp14:editId="0F79991F">
             <wp:extent cx="4680000" cy="2624400"/>
             <wp:effectExtent l="0" t="0" r="6350" b="5080"/>
             <wp:docPr id="3" name="Imagen 3">
@@ -4013,7 +4007,6 @@
       </w:pPr>
       <w:bookmarkStart w:id="6" w:name="_Toc234581001"/>
       <w:r>
-        <w:lastRenderedPageBreak/>
         <w:t>Clasificación de hoteles</w:t>
       </w:r>
       <w:bookmarkEnd w:id="6"/>
@@ -4102,7 +4095,7 @@
           <w:lang w:eastAsia="es-CO"/>
         </w:rPr>
         <w:drawing>
-          <wp:inline distT="0" distB="0" distL="0" distR="0" wp14:anchorId="50C1000D" wp14:editId="28D0067C">
+          <wp:inline distT="0" distB="0" distL="0" distR="0" wp14:anchorId="50C1000D" wp14:editId="46F3ECFD">
             <wp:extent cx="4680000" cy="1638000"/>
             <wp:effectExtent l="0" t="0" r="6350" b="635"/>
             <wp:docPr id="13" name="Imagen 13" descr="En la figura 2 se enuncian los criterios de evaluación para el otorgamiento y categorización de estrellas en los hoteles de acuerdo a la norma NTSH006. "/>
@@ -5043,31 +5036,13 @@
         <w:lastRenderedPageBreak/>
         <w:t xml:space="preserve">Servicios de restaurante y </w:t>
       </w:r>
-      <w:proofErr w:type="spellStart"/>
       <w:r>
         <w:rPr>
           <w:rStyle w:val="Extranjerismo"/>
           <w:lang w:val="es-419" w:eastAsia="es-CO"/>
         </w:rPr>
-        <w:t>room</w:t>
-      </w:r>
-      <w:proofErr w:type="spellEnd"/>
-      <w:r>
-        <w:rPr>
-          <w:rStyle w:val="Extranjerismo"/>
-          <w:lang w:val="es-419" w:eastAsia="es-CO"/>
-        </w:rPr>
-        <w:t xml:space="preserve"> </w:t>
-      </w:r>
-      <w:proofErr w:type="spellStart"/>
-      <w:r>
-        <w:rPr>
-          <w:rStyle w:val="Extranjerismo"/>
-          <w:lang w:val="es-419" w:eastAsia="es-CO"/>
-        </w:rPr>
-        <w:t>service</w:t>
-      </w:r>
-      <w:proofErr w:type="spellEnd"/>
+        <w:t>room service</w:t>
+      </w:r>
       <w:r>
         <w:rPr>
           <w:lang w:val="es-419" w:eastAsia="es-CO"/>
@@ -6397,53 +6372,12 @@
         </w:rPr>
         <w:t xml:space="preserve">VIP = </w:t>
       </w:r>
-      <w:proofErr w:type="spellStart"/>
       <w:r>
         <w:rPr>
           <w:rStyle w:val="Extranjerismo"/>
           <w:lang w:val="es-419" w:eastAsia="es-CO"/>
         </w:rPr>
-        <w:t>Very</w:t>
-      </w:r>
-      <w:proofErr w:type="spellEnd"/>
-      <w:r>
-        <w:rPr>
-          <w:rStyle w:val="Extranjerismo"/>
-          <w:lang w:val="es-419" w:eastAsia="es-CO"/>
-        </w:rPr>
-        <w:t xml:space="preserve"> </w:t>
-      </w:r>
-      <w:proofErr w:type="spellStart"/>
-      <w:r>
-        <w:rPr>
-          <w:rStyle w:val="Extranjerismo"/>
-          <w:lang w:val="es-419" w:eastAsia="es-CO"/>
-        </w:rPr>
-        <w:t>important</w:t>
-      </w:r>
-      <w:proofErr w:type="spellEnd"/>
-      <w:r>
-        <w:rPr>
-          <w:rStyle w:val="Extranjerismo"/>
-          <w:lang w:val="es-419" w:eastAsia="es-CO"/>
-        </w:rPr>
-        <w:t xml:space="preserve"> </w:t>
-      </w:r>
-      <w:proofErr w:type="spellStart"/>
-      <w:r>
-        <w:rPr>
-          <w:rStyle w:val="Extranjerismo"/>
-          <w:lang w:val="es-419" w:eastAsia="es-CO"/>
-        </w:rPr>
-        <w:t>person</w:t>
-      </w:r>
-      <w:proofErr w:type="spellEnd"/>
-      <w:r>
-        <w:rPr>
-          <w:rStyle w:val="Extranjerismo"/>
-          <w:lang w:val="es-419" w:eastAsia="es-CO"/>
-        </w:rPr>
-        <w:t xml:space="preserve"> / People.</w:t>
+        <w:t>Very important person / People.</w:t>
       </w:r>
     </w:p>
     <w:p>
@@ -6468,33 +6402,8 @@
           <w:rStyle w:val="Extranjerismo"/>
           <w:lang w:val="es-419" w:eastAsia="es-CO"/>
         </w:rPr>
-        <w:t xml:space="preserve">Do </w:t>
-      </w:r>
-      <w:proofErr w:type="spellStart"/>
-      <w:r>
-        <w:rPr>
-          <w:rStyle w:val="Extranjerismo"/>
-          <w:lang w:val="es-419" w:eastAsia="es-CO"/>
-        </w:rPr>
-        <w:t>not</w:t>
-      </w:r>
-      <w:proofErr w:type="spellEnd"/>
-      <w:r>
-        <w:rPr>
-          <w:rStyle w:val="Extranjerismo"/>
-          <w:lang w:val="es-419" w:eastAsia="es-CO"/>
-        </w:rPr>
-        <w:t xml:space="preserve"> </w:t>
-      </w:r>
-      <w:proofErr w:type="spellStart"/>
-      <w:r>
-        <w:rPr>
-          <w:rStyle w:val="Extranjerismo"/>
-          <w:lang w:val="es-419" w:eastAsia="es-CO"/>
-        </w:rPr>
-        <w:t>disturb</w:t>
-      </w:r>
-      <w:proofErr w:type="spellEnd"/>
+        <w:t>Do not disturb</w:t>
+      </w:r>
       <w:r>
         <w:rPr>
           <w:lang w:val="es-419" w:eastAsia="es-CO"/>
@@ -6531,19 +6440,11 @@
           <w:lang w:val="es-419" w:eastAsia="es-CO"/>
         </w:rPr>
       </w:pPr>
-      <w:proofErr w:type="spellStart"/>
-      <w:r>
-        <w:rPr>
-          <w:lang w:val="es-419" w:eastAsia="es-CO"/>
-        </w:rPr>
-        <w:t>CEx</w:t>
-      </w:r>
-      <w:proofErr w:type="spellEnd"/>
-      <w:r>
-        <w:rPr>
-          <w:lang w:val="es-419" w:eastAsia="es-CO"/>
-        </w:rPr>
-        <w:t xml:space="preserve"> – Cama extra.</w:t>
+      <w:r>
+        <w:rPr>
+          <w:lang w:val="es-419" w:eastAsia="es-CO"/>
+        </w:rPr>
+        <w:t>CEx – Cama extra.</w:t>
       </w:r>
     </w:p>
     <w:p>
@@ -6656,7 +6557,6 @@
         </w:rPr>
         <w:t xml:space="preserve">El departamento de recepción cumple un papel estratégico dentro de la organización hotelera, ya que constituye el principal punto de contacto entre el hotel y el huésped. Es responsable de procesos clave como el </w:t>
       </w:r>
-      <w:proofErr w:type="spellStart"/>
       <w:r>
         <w:rPr>
           <w:rStyle w:val="Extranjerismo"/>
@@ -6664,7 +6564,6 @@
         </w:rPr>
         <w:t>check</w:t>
       </w:r>
-      <w:proofErr w:type="spellEnd"/>
       <w:r>
         <w:rPr>
           <w:rStyle w:val="Extranjerismo"/>
@@ -6685,7 +6584,6 @@
         </w:rPr>
         <w:t xml:space="preserve">, el </w:t>
       </w:r>
-      <w:proofErr w:type="spellStart"/>
       <w:r>
         <w:rPr>
           <w:rStyle w:val="Extranjerismo"/>
@@ -6707,14 +6605,12 @@
         </w:rPr>
         <w:t>out</w:t>
       </w:r>
-      <w:proofErr w:type="spellEnd"/>
       <w:r>
         <w:rPr>
           <w:lang w:val="es-419" w:eastAsia="es-CO"/>
         </w:rPr>
         <w:t xml:space="preserve">, la gestión de reservas, la asignación de habitaciones y el control de la información del huésped. Desde el enfoque técnico profesional, la recepción actúa como un eje articulador de la operación, ya que mantiene comunicación constante con áreas como </w:t>
       </w:r>
-      <w:proofErr w:type="spellStart"/>
       <w:r>
         <w:rPr>
           <w:rStyle w:val="Extranjerismo"/>
@@ -6722,7 +6618,6 @@
         </w:rPr>
         <w:t>housekeeping</w:t>
       </w:r>
-      <w:proofErr w:type="spellEnd"/>
       <w:r>
         <w:rPr>
           <w:lang w:val="es-419" w:eastAsia="es-CO"/>
@@ -6742,7 +6637,6 @@
         </w:rPr>
         <w:t xml:space="preserve">El departamento de </w:t>
       </w:r>
-      <w:proofErr w:type="spellStart"/>
       <w:r>
         <w:rPr>
           <w:rStyle w:val="Extranjerismo"/>
@@ -6750,7 +6644,6 @@
         </w:rPr>
         <w:t>housekeeping</w:t>
       </w:r>
-      <w:proofErr w:type="spellEnd"/>
       <w:r>
         <w:rPr>
           <w:lang w:val="es-419" w:eastAsia="es-CO"/>
@@ -6764,7 +6657,6 @@
         <w:lastRenderedPageBreak/>
         <w:t xml:space="preserve">áreas comunes. Su labor influye directamente en la percepción de calidad del servicio, ya que garantiza condiciones adecuadas de higiene, confort y seguridad. La coordinación entre </w:t>
       </w:r>
-      <w:proofErr w:type="spellStart"/>
       <w:r>
         <w:rPr>
           <w:rStyle w:val="Extranjerismo"/>
@@ -6772,7 +6664,6 @@
         </w:rPr>
         <w:t>housekeeping</w:t>
       </w:r>
-      <w:proofErr w:type="spellEnd"/>
       <w:r>
         <w:rPr>
           <w:lang w:val="es-419" w:eastAsia="es-CO"/>
@@ -6805,31 +6696,13 @@
         </w:rPr>
         <w:t xml:space="preserve">El departamento de alimentos y bebidas, cuando el establecimiento lo incluye, se encarga de la prestación de servicios de restaurante, bar, </w:t>
       </w:r>
-      <w:proofErr w:type="spellStart"/>
       <w:r>
         <w:rPr>
           <w:rStyle w:val="Extranjerismo"/>
           <w:lang w:val="es-419" w:eastAsia="es-CO"/>
         </w:rPr>
-        <w:t>room</w:t>
-      </w:r>
-      <w:proofErr w:type="spellEnd"/>
-      <w:r>
-        <w:rPr>
-          <w:rStyle w:val="Extranjerismo"/>
-          <w:lang w:val="es-419" w:eastAsia="es-CO"/>
-        </w:rPr>
-        <w:t xml:space="preserve"> </w:t>
-      </w:r>
-      <w:proofErr w:type="spellStart"/>
-      <w:r>
-        <w:rPr>
-          <w:rStyle w:val="Extranjerismo"/>
-          <w:lang w:val="es-419" w:eastAsia="es-CO"/>
-        </w:rPr>
-        <w:t>service</w:t>
-      </w:r>
-      <w:proofErr w:type="spellEnd"/>
+        <w:t>room service</w:t>
+      </w:r>
       <w:r>
         <w:rPr>
           <w:lang w:val="es-419" w:eastAsia="es-CO"/>
@@ -6944,7 +6817,7 @@
           <w:lang w:val="es-419" w:eastAsia="es-CO"/>
         </w:rPr>
         <w:drawing>
-          <wp:inline distT="0" distB="0" distL="0" distR="0" wp14:anchorId="0FE42805" wp14:editId="788F5545">
+          <wp:inline distT="0" distB="0" distL="0" distR="0" wp14:anchorId="0FE42805" wp14:editId="16D77EA1">
             <wp:extent cx="4680000" cy="2199600"/>
             <wp:effectExtent l="0" t="0" r="6350" b="0"/>
             <wp:docPr id="11" name="Imagen 11" descr="La figura 3 muestra gráficamente un ejemplo de estructura organizacional u organigrama de un establecimiento de alojamiento hotelero. "/>
@@ -7501,7 +7374,6 @@
         </w:rPr>
         <w:t xml:space="preserve">argo responsable de la planificación, supervisión y control del área de </w:t>
       </w:r>
-      <w:proofErr w:type="spellStart"/>
       <w:r>
         <w:rPr>
           <w:rStyle w:val="Extranjerismo"/>
@@ -7509,7 +7381,6 @@
         </w:rPr>
         <w:t>housekeeping</w:t>
       </w:r>
-      <w:proofErr w:type="spellEnd"/>
       <w:r>
         <w:rPr>
           <w:rFonts w:ascii="Calibri" w:hAnsi="Calibri" w:cs="Calibri"/>
@@ -7562,7 +7433,6 @@
           <w:lang w:val="es-419"/>
         </w:rPr>
       </w:pPr>
-      <w:proofErr w:type="spellStart"/>
       <w:r>
         <w:rPr>
           <w:rStyle w:val="Extranjerismo"/>
@@ -7570,9 +7440,33 @@
           <w:bCs/>
           <w:lang w:val="es-419"/>
         </w:rPr>
-        <w:t>Check</w:t>
-      </w:r>
-      <w:proofErr w:type="spellEnd"/>
+        <w:t>Check-in</w:t>
+      </w:r>
+      <w:r>
+        <w:rPr>
+          <w:rFonts w:ascii="Calibri" w:hAnsi="Calibri" w:cs="Calibri"/>
+          <w:szCs w:val="28"/>
+          <w:lang w:val="es-419"/>
+        </w:rPr>
+        <w:t>: p</w:t>
+      </w:r>
+      <w:r>
+        <w:rPr>
+          <w:rFonts w:ascii="Calibri" w:hAnsi="Calibri" w:cs="Calibri"/>
+          <w:szCs w:val="28"/>
+          <w:lang w:val="es-419"/>
+        </w:rPr>
+        <w:t>roceso mediante el cual se realiza el registro y acomodación de uno o varios huéspedes en un establecimiento de alojamiento, asignando habitación y definiendo la forma de pago, con el fin de mantener actualizada la información durante la estancia.</w:t>
+      </w:r>
+    </w:p>
+    <w:p>
+      <w:pPr>
+        <w:rPr>
+          <w:rFonts w:ascii="Calibri" w:hAnsi="Calibri" w:cs="Calibri"/>
+          <w:szCs w:val="28"/>
+          <w:lang w:val="es-419"/>
+        </w:rPr>
+      </w:pPr>
       <w:r>
         <w:rPr>
           <w:rStyle w:val="Extranjerismo"/>
@@ -7580,34 +7474,18 @@
           <w:bCs/>
           <w:lang w:val="es-419"/>
         </w:rPr>
-        <w:t>-in</w:t>
+        <w:t>Check-in</w:t>
       </w:r>
       <w:r>
         <w:rPr>
           <w:rFonts w:ascii="Calibri" w:hAnsi="Calibri" w:cs="Calibri"/>
-          <w:szCs w:val="28"/>
-          <w:lang w:val="es-419"/>
-        </w:rPr>
-        <w:t>: p</w:t>
-      </w:r>
-      <w:r>
-        <w:rPr>
-          <w:rFonts w:ascii="Calibri" w:hAnsi="Calibri" w:cs="Calibri"/>
-          <w:szCs w:val="28"/>
-          <w:lang w:val="es-419"/>
-        </w:rPr>
-        <w:t>roceso mediante el cual se realiza el registro y acomodación de uno o varios huéspedes en un establecimiento de alojamiento, asignando habitación y definiendo la forma de pago, con el fin de mantener actualizada la información durante la estancia.</w:t>
-      </w:r>
-    </w:p>
-    <w:p>
-      <w:pPr>
-        <w:rPr>
-          <w:rFonts w:ascii="Calibri" w:hAnsi="Calibri" w:cs="Calibri"/>
-          <w:szCs w:val="28"/>
-          <w:lang w:val="es-419"/>
-        </w:rPr>
-      </w:pPr>
-      <w:proofErr w:type="spellStart"/>
+          <w:b/>
+          <w:bCs/>
+          <w:szCs w:val="28"/>
+          <w:lang w:val="es-419"/>
+        </w:rPr>
+        <w:t xml:space="preserve"> anticipado (</w:t>
+      </w:r>
       <w:r>
         <w:rPr>
           <w:rStyle w:val="Extranjerismo"/>
@@ -7615,9 +7493,43 @@
           <w:bCs/>
           <w:lang w:val="es-419"/>
         </w:rPr>
-        <w:t>Check</w:t>
-      </w:r>
-      <w:proofErr w:type="spellEnd"/>
+        <w:t>Early check-in</w:t>
+      </w:r>
+      <w:r>
+        <w:rPr>
+          <w:rFonts w:ascii="Calibri" w:hAnsi="Calibri" w:cs="Calibri"/>
+          <w:b/>
+          <w:bCs/>
+          <w:szCs w:val="28"/>
+          <w:lang w:val="es-419"/>
+        </w:rPr>
+        <w:t>):</w:t>
+      </w:r>
+      <w:r>
+        <w:rPr>
+          <w:rFonts w:ascii="Calibri" w:hAnsi="Calibri" w:cs="Calibri"/>
+          <w:szCs w:val="28"/>
+          <w:lang w:val="es-419"/>
+        </w:rPr>
+        <w:t xml:space="preserve"> s</w:t>
+      </w:r>
+      <w:r>
+        <w:rPr>
+          <w:rFonts w:ascii="Calibri" w:hAnsi="Calibri" w:cs="Calibri"/>
+          <w:szCs w:val="28"/>
+          <w:lang w:val="es-419"/>
+        </w:rPr>
+        <w:t>ervicio que permite el ingreso del huésped antes de la hora establecida, sujeto a disponibilidad y a las políticas del establecimiento.</w:t>
+      </w:r>
+    </w:p>
+    <w:p>
+      <w:pPr>
+        <w:rPr>
+          <w:rFonts w:ascii="Calibri" w:hAnsi="Calibri" w:cs="Calibri"/>
+          <w:szCs w:val="28"/>
+          <w:lang w:val="es-419"/>
+        </w:rPr>
+      </w:pPr>
       <w:r>
         <w:rPr>
           <w:rStyle w:val="Extranjerismo"/>
@@ -7625,7 +7537,42 @@
           <w:bCs/>
           <w:lang w:val="es-419"/>
         </w:rPr>
-        <w:t>-in</w:t>
+        <w:t>Check-out</w:t>
+      </w:r>
+      <w:r>
+        <w:rPr>
+          <w:rFonts w:ascii="Calibri" w:hAnsi="Calibri" w:cs="Calibri"/>
+          <w:szCs w:val="28"/>
+          <w:lang w:val="es-419"/>
+        </w:rPr>
+        <w:t>: p</w:t>
+      </w:r>
+      <w:r>
+        <w:rPr>
+          <w:rFonts w:ascii="Calibri" w:hAnsi="Calibri" w:cs="Calibri"/>
+          <w:szCs w:val="28"/>
+          <w:lang w:val="es-419"/>
+        </w:rPr>
+        <w:t>roceso mediante el cual el huésped entrega la habitación ocupada, se revisa y liquida la cuenta por los servicios consumidos y se formaliza la salida del establecimiento.</w:t>
+      </w:r>
+    </w:p>
+    <w:p>
+      <w:pPr>
+        <w:rPr>
+          <w:rFonts w:ascii="Calibri" w:hAnsi="Calibri" w:cs="Calibri"/>
+          <w:szCs w:val="28"/>
+          <w:lang w:val="es-419"/>
+        </w:rPr>
+      </w:pPr>
+      <w:r>
+        <w:rPr>
+          <w:rStyle w:val="Extranjerismo"/>
+          <w:b/>
+          <w:bCs/>
+          <w:lang w:val="es-419"/>
+        </w:rPr>
+        <w:lastRenderedPageBreak/>
+        <w:t>Check-out</w:t>
       </w:r>
       <w:r>
         <w:rPr>
@@ -7635,9 +7582,8 @@
           <w:szCs w:val="28"/>
           <w:lang w:val="es-419"/>
         </w:rPr>
-        <w:t xml:space="preserve"> anticipado (</w:t>
-      </w:r>
-      <w:proofErr w:type="spellStart"/>
+        <w:t xml:space="preserve"> tardío (</w:t>
+      </w:r>
       <w:r>
         <w:rPr>
           <w:rStyle w:val="Extranjerismo"/>
@@ -7645,9 +7591,178 @@
           <w:bCs/>
           <w:lang w:val="es-419"/>
         </w:rPr>
-        <w:t>Early</w:t>
-      </w:r>
-      <w:proofErr w:type="spellEnd"/>
+        <w:t>Late check-out</w:t>
+      </w:r>
+      <w:r>
+        <w:rPr>
+          <w:rFonts w:ascii="Calibri" w:hAnsi="Calibri" w:cs="Calibri"/>
+          <w:b/>
+          <w:bCs/>
+          <w:szCs w:val="28"/>
+          <w:lang w:val="es-419"/>
+        </w:rPr>
+        <w:t>):</w:t>
+      </w:r>
+      <w:r>
+        <w:rPr>
+          <w:rFonts w:ascii="Calibri" w:hAnsi="Calibri" w:cs="Calibri"/>
+          <w:szCs w:val="28"/>
+          <w:lang w:val="es-419"/>
+        </w:rPr>
+        <w:t xml:space="preserve"> s</w:t>
+      </w:r>
+      <w:r>
+        <w:rPr>
+          <w:rFonts w:ascii="Calibri" w:hAnsi="Calibri" w:cs="Calibri"/>
+          <w:szCs w:val="28"/>
+          <w:lang w:val="es-419"/>
+        </w:rPr>
+        <w:t>ervicio que autoriza al huésped a permanecer en la habitación después de la hora de salida establecida, de acuerdo con la disponibilidad y las condiciones del hotel.</w:t>
+      </w:r>
+    </w:p>
+    <w:p>
+      <w:pPr>
+        <w:rPr>
+          <w:rFonts w:ascii="Calibri" w:hAnsi="Calibri" w:cs="Calibri"/>
+          <w:szCs w:val="28"/>
+          <w:lang w:val="es-419"/>
+        </w:rPr>
+      </w:pPr>
+      <w:r>
+        <w:rPr>
+          <w:rFonts w:ascii="Calibri" w:hAnsi="Calibri" w:cs="Calibri"/>
+          <w:b/>
+          <w:bCs/>
+          <w:szCs w:val="28"/>
+          <w:lang w:val="es-419"/>
+        </w:rPr>
+        <w:t>Conserjería</w:t>
+      </w:r>
+      <w:r>
+        <w:rPr>
+          <w:rFonts w:ascii="Calibri" w:hAnsi="Calibri" w:cs="Calibri"/>
+          <w:szCs w:val="28"/>
+          <w:lang w:val="es-419"/>
+        </w:rPr>
+        <w:t>: á</w:t>
+      </w:r>
+      <w:r>
+        <w:rPr>
+          <w:rFonts w:ascii="Calibri" w:hAnsi="Calibri" w:cs="Calibri"/>
+          <w:szCs w:val="28"/>
+          <w:lang w:val="es-419"/>
+        </w:rPr>
+        <w:t>rea del hotel encargada de ofrecer información, asistencia y servicios personalizados al huésped, contribuyendo a mejorar su experiencia durante la estadía.</w:t>
+      </w:r>
+    </w:p>
+    <w:p>
+      <w:pPr>
+        <w:rPr>
+          <w:rFonts w:ascii="Calibri" w:hAnsi="Calibri" w:cs="Calibri"/>
+          <w:szCs w:val="28"/>
+          <w:lang w:val="es-419"/>
+        </w:rPr>
+      </w:pPr>
+      <w:r>
+        <w:rPr>
+          <w:rFonts w:ascii="Calibri" w:hAnsi="Calibri" w:cs="Calibri"/>
+          <w:b/>
+          <w:bCs/>
+          <w:szCs w:val="28"/>
+          <w:lang w:val="es-419"/>
+        </w:rPr>
+        <w:t>Disponibilidad:</w:t>
+      </w:r>
+      <w:r>
+        <w:rPr>
+          <w:rFonts w:ascii="Calibri" w:hAnsi="Calibri" w:cs="Calibri"/>
+          <w:szCs w:val="28"/>
+          <w:lang w:val="es-419"/>
+        </w:rPr>
+        <w:t xml:space="preserve"> c</w:t>
+      </w:r>
+      <w:r>
+        <w:rPr>
+          <w:rFonts w:ascii="Calibri" w:hAnsi="Calibri" w:cs="Calibri"/>
+          <w:szCs w:val="28"/>
+          <w:lang w:val="es-419"/>
+        </w:rPr>
+        <w:t>apacidad real del establecimiento para ofrecer habitaciones o servicios en una fecha determinada, de acuerdo con el nivel de ocupación y las reservas existentes.</w:t>
+      </w:r>
+    </w:p>
+    <w:p>
+      <w:pPr>
+        <w:rPr>
+          <w:rFonts w:ascii="Calibri" w:hAnsi="Calibri" w:cs="Calibri"/>
+          <w:szCs w:val="28"/>
+          <w:lang w:val="es-419"/>
+        </w:rPr>
+      </w:pPr>
+      <w:r>
+        <w:rPr>
+          <w:rFonts w:ascii="Calibri" w:hAnsi="Calibri" w:cs="Calibri"/>
+          <w:b/>
+          <w:bCs/>
+          <w:szCs w:val="28"/>
+          <w:lang w:val="es-419"/>
+        </w:rPr>
+        <w:t>Estancia</w:t>
+      </w:r>
+      <w:r>
+        <w:rPr>
+          <w:rFonts w:ascii="Calibri" w:hAnsi="Calibri" w:cs="Calibri"/>
+          <w:szCs w:val="28"/>
+          <w:lang w:val="es-419"/>
+        </w:rPr>
+        <w:t>: p</w:t>
+      </w:r>
+      <w:r>
+        <w:rPr>
+          <w:rFonts w:ascii="Calibri" w:hAnsi="Calibri" w:cs="Calibri"/>
+          <w:szCs w:val="28"/>
+          <w:lang w:val="es-419"/>
+        </w:rPr>
+        <w:t xml:space="preserve">eriodo comprendido entre el </w:t>
+      </w:r>
+      <w:r>
+        <w:rPr>
+          <w:rStyle w:val="Extranjerismo"/>
+          <w:lang w:val="es-419"/>
+        </w:rPr>
+        <w:t>check-in</w:t>
+      </w:r>
+      <w:r>
+        <w:rPr>
+          <w:rFonts w:ascii="Calibri" w:hAnsi="Calibri" w:cs="Calibri"/>
+          <w:szCs w:val="28"/>
+          <w:lang w:val="es-419"/>
+        </w:rPr>
+        <w:t xml:space="preserve"> y el </w:t>
+      </w:r>
+      <w:r>
+        <w:rPr>
+          <w:rStyle w:val="Extranjerismo"/>
+          <w:lang w:val="es-419"/>
+        </w:rPr>
+        <w:t>check-out</w:t>
+      </w:r>
+      <w:r>
+        <w:rPr>
+          <w:rFonts w:ascii="Calibri" w:hAnsi="Calibri" w:cs="Calibri"/>
+          <w:szCs w:val="28"/>
+          <w:lang w:val="es-419"/>
+        </w:rPr>
+        <w:t>, durante el cual el huésped permanece alojado en el establecimiento.</w:t>
+      </w:r>
+    </w:p>
+    <w:p>
+      <w:pPr>
+        <w:rPr>
+          <w:rFonts w:ascii="Calibri" w:hAnsi="Calibri" w:cs="Calibri"/>
+          <w:szCs w:val="28"/>
+          <w:lang w:val="es-419"/>
+        </w:rPr>
+      </w:pPr>
       <w:r>
         <w:rPr>
           <w:rStyle w:val="Extranjerismo"/>
@@ -7655,9 +7770,173 @@
           <w:bCs/>
           <w:lang w:val="es-419"/>
         </w:rPr>
-        <w:t xml:space="preserve"> </w:t>
-      </w:r>
-      <w:proofErr w:type="spellStart"/>
+        <w:t>Housekeeping</w:t>
+      </w:r>
+      <w:r>
+        <w:rPr>
+          <w:rFonts w:ascii="Calibri" w:hAnsi="Calibri" w:cs="Calibri"/>
+          <w:szCs w:val="28"/>
+          <w:lang w:val="es-419"/>
+        </w:rPr>
+        <w:t>: d</w:t>
+      </w:r>
+      <w:r>
+        <w:rPr>
+          <w:rFonts w:ascii="Calibri" w:hAnsi="Calibri" w:cs="Calibri"/>
+          <w:szCs w:val="28"/>
+          <w:lang w:val="es-419"/>
+        </w:rPr>
+        <w:t>epartamento operativo responsable de la limpieza, orden, presentación y mantenimiento básico de habitaciones y áreas comunes del hotel.</w:t>
+      </w:r>
+    </w:p>
+    <w:p>
+      <w:pPr>
+        <w:rPr>
+          <w:rFonts w:ascii="Calibri" w:hAnsi="Calibri" w:cs="Calibri"/>
+          <w:szCs w:val="28"/>
+          <w:lang w:val="es-419"/>
+        </w:rPr>
+      </w:pPr>
+      <w:r>
+        <w:rPr>
+          <w:rFonts w:ascii="Calibri" w:hAnsi="Calibri" w:cs="Calibri"/>
+          <w:b/>
+          <w:bCs/>
+          <w:szCs w:val="28"/>
+          <w:lang w:val="es-419"/>
+        </w:rPr>
+        <w:t>Inventario hotelero</w:t>
+      </w:r>
+      <w:r>
+        <w:rPr>
+          <w:rFonts w:ascii="Calibri" w:hAnsi="Calibri" w:cs="Calibri"/>
+          <w:szCs w:val="28"/>
+          <w:lang w:val="es-419"/>
+        </w:rPr>
+        <w:t>: c</w:t>
+      </w:r>
+      <w:r>
+        <w:rPr>
+          <w:rFonts w:ascii="Calibri" w:hAnsi="Calibri" w:cs="Calibri"/>
+          <w:szCs w:val="28"/>
+          <w:lang w:val="es-419"/>
+        </w:rPr>
+        <w:t>onjunto de habitaciones, servicios y recursos físicos disponibles para la operación y comercialización del establecimiento de alojamiento.</w:t>
+      </w:r>
+    </w:p>
+    <w:p>
+      <w:pPr>
+        <w:rPr>
+          <w:rFonts w:ascii="Calibri" w:hAnsi="Calibri" w:cs="Calibri"/>
+          <w:szCs w:val="28"/>
+          <w:lang w:val="es-419"/>
+        </w:rPr>
+      </w:pPr>
+      <w:r>
+        <w:rPr>
+          <w:rFonts w:ascii="Calibri" w:hAnsi="Calibri" w:cs="Calibri"/>
+          <w:b/>
+          <w:bCs/>
+          <w:szCs w:val="28"/>
+          <w:lang w:val="es-419"/>
+        </w:rPr>
+        <w:t>Norma de competencia</w:t>
+      </w:r>
+      <w:r>
+        <w:rPr>
+          <w:rFonts w:ascii="Calibri" w:hAnsi="Calibri" w:cs="Calibri"/>
+          <w:szCs w:val="28"/>
+          <w:lang w:val="es-419"/>
+        </w:rPr>
+        <w:t>: c</w:t>
+      </w:r>
+      <w:r>
+        <w:rPr>
+          <w:rFonts w:ascii="Calibri" w:hAnsi="Calibri" w:cs="Calibri"/>
+          <w:szCs w:val="28"/>
+          <w:lang w:val="es-419"/>
+        </w:rPr>
+        <w:t>onjunto de funciones laborales que describen el desempeño esperado en un proceso de trabajo, con valor y significado para el ejercicio profesional.</w:t>
+      </w:r>
+    </w:p>
+    <w:p>
+      <w:pPr>
+        <w:rPr>
+          <w:rFonts w:ascii="Calibri" w:hAnsi="Calibri" w:cs="Calibri"/>
+          <w:szCs w:val="28"/>
+          <w:lang w:val="es-419"/>
+        </w:rPr>
+      </w:pPr>
+      <w:r>
+        <w:rPr>
+          <w:rFonts w:ascii="Calibri" w:hAnsi="Calibri" w:cs="Calibri"/>
+          <w:b/>
+          <w:bCs/>
+          <w:szCs w:val="28"/>
+          <w:lang w:val="es-419"/>
+        </w:rPr>
+        <w:t>Objetivos de calidad</w:t>
+      </w:r>
+      <w:r>
+        <w:rPr>
+          <w:rFonts w:ascii="Calibri" w:hAnsi="Calibri" w:cs="Calibri"/>
+          <w:szCs w:val="28"/>
+          <w:lang w:val="es-419"/>
+        </w:rPr>
+        <w:t>: r</w:t>
+      </w:r>
+      <w:r>
+        <w:rPr>
+          <w:rFonts w:ascii="Calibri" w:hAnsi="Calibri" w:cs="Calibri"/>
+          <w:szCs w:val="28"/>
+          <w:lang w:val="es-419"/>
+        </w:rPr>
+        <w:t>esultados esperados relacionados con la calidad del servicio, definidos a partir de la política de calidad de la organización.</w:t>
+      </w:r>
+    </w:p>
+    <w:p>
+      <w:pPr>
+        <w:rPr>
+          <w:rFonts w:ascii="Calibri" w:hAnsi="Calibri" w:cs="Calibri"/>
+          <w:szCs w:val="28"/>
+          <w:lang w:val="es-419"/>
+        </w:rPr>
+      </w:pPr>
+      <w:r>
+        <w:rPr>
+          <w:rFonts w:ascii="Calibri" w:hAnsi="Calibri" w:cs="Calibri"/>
+          <w:b/>
+          <w:bCs/>
+          <w:szCs w:val="28"/>
+          <w:lang w:val="es-419"/>
+        </w:rPr>
+        <w:t>Ocupación</w:t>
+      </w:r>
+      <w:r>
+        <w:rPr>
+          <w:rFonts w:ascii="Calibri" w:hAnsi="Calibri" w:cs="Calibri"/>
+          <w:szCs w:val="28"/>
+          <w:lang w:val="es-419"/>
+        </w:rPr>
+        <w:t>: i</w:t>
+      </w:r>
+      <w:r>
+        <w:rPr>
+          <w:rFonts w:ascii="Calibri" w:hAnsi="Calibri" w:cs="Calibri"/>
+          <w:szCs w:val="28"/>
+          <w:lang w:val="es-419"/>
+        </w:rPr>
+        <w:t>ndicador que refleja el uso efectivo de las habitaciones disponibles durante un periodo determinado, generalmente expresado en porcentaje.</w:t>
+      </w:r>
+    </w:p>
+    <w:p>
+      <w:pPr>
+        <w:rPr>
+          <w:rFonts w:ascii="Calibri" w:hAnsi="Calibri" w:cs="Calibri"/>
+          <w:szCs w:val="28"/>
+          <w:lang w:val="es-419"/>
+        </w:rPr>
+      </w:pPr>
       <w:r>
         <w:rPr>
           <w:rStyle w:val="Extranjerismo"/>
@@ -7665,9 +7944,430 @@
           <w:bCs/>
           <w:lang w:val="es-419"/>
         </w:rPr>
-        <w:t>check</w:t>
-      </w:r>
-      <w:proofErr w:type="spellEnd"/>
+        <w:lastRenderedPageBreak/>
+        <w:t>Par stock</w:t>
+      </w:r>
+      <w:r>
+        <w:rPr>
+          <w:rFonts w:ascii="Calibri" w:hAnsi="Calibri" w:cs="Calibri"/>
+          <w:b/>
+          <w:bCs/>
+          <w:szCs w:val="28"/>
+          <w:lang w:val="es-419"/>
+        </w:rPr>
+        <w:t>:</w:t>
+      </w:r>
+      <w:r>
+        <w:rPr>
+          <w:rFonts w:ascii="Calibri" w:hAnsi="Calibri" w:cs="Calibri"/>
+          <w:szCs w:val="28"/>
+          <w:lang w:val="es-419"/>
+        </w:rPr>
+        <w:t xml:space="preserve"> c</w:t>
+      </w:r>
+      <w:r>
+        <w:rPr>
+          <w:rFonts w:ascii="Calibri" w:hAnsi="Calibri" w:cs="Calibri"/>
+          <w:szCs w:val="28"/>
+          <w:lang w:val="es-419"/>
+        </w:rPr>
+        <w:t>antidad mínima de elementos operativos (lencería, vajilla, utensilios, entre otros) necesarios para garantizar la continuidad del servicio según la capacidad instalada.</w:t>
+      </w:r>
+    </w:p>
+    <w:p>
+      <w:pPr>
+        <w:rPr>
+          <w:rFonts w:ascii="Calibri" w:hAnsi="Calibri" w:cs="Calibri"/>
+          <w:szCs w:val="28"/>
+          <w:lang w:val="es-419"/>
+        </w:rPr>
+      </w:pPr>
+      <w:r>
+        <w:rPr>
+          <w:rFonts w:ascii="Calibri" w:hAnsi="Calibri" w:cs="Calibri"/>
+          <w:b/>
+          <w:bCs/>
+          <w:szCs w:val="28"/>
+          <w:lang w:val="es-419"/>
+        </w:rPr>
+        <w:t>Plan de emergencia</w:t>
+      </w:r>
+      <w:r>
+        <w:rPr>
+          <w:rFonts w:ascii="Calibri" w:hAnsi="Calibri" w:cs="Calibri"/>
+          <w:szCs w:val="28"/>
+          <w:lang w:val="es-419"/>
+        </w:rPr>
+        <w:t>: c</w:t>
+      </w:r>
+      <w:r>
+        <w:rPr>
+          <w:rFonts w:ascii="Calibri" w:hAnsi="Calibri" w:cs="Calibri"/>
+          <w:szCs w:val="28"/>
+          <w:lang w:val="es-419"/>
+        </w:rPr>
+        <w:t>onjunto de medidas y procedimientos destinados a salvaguardar la vida de las personas y los bienes del establecimiento ante situaciones de riesgo o desastre.</w:t>
+      </w:r>
+    </w:p>
+    <w:p>
+      <w:pPr>
+        <w:rPr>
+          <w:rFonts w:ascii="Calibri" w:hAnsi="Calibri" w:cs="Calibri"/>
+          <w:szCs w:val="28"/>
+          <w:lang w:val="es-419"/>
+        </w:rPr>
+      </w:pPr>
+      <w:r>
+        <w:rPr>
+          <w:rFonts w:ascii="Calibri" w:hAnsi="Calibri" w:cs="Calibri"/>
+          <w:b/>
+          <w:bCs/>
+          <w:szCs w:val="28"/>
+          <w:lang w:val="es-419"/>
+        </w:rPr>
+        <w:t>Planta</w:t>
+      </w:r>
+      <w:r>
+        <w:rPr>
+          <w:rFonts w:ascii="Calibri" w:hAnsi="Calibri" w:cs="Calibri"/>
+          <w:szCs w:val="28"/>
+          <w:lang w:val="es-419"/>
+        </w:rPr>
+        <w:t>: s</w:t>
+      </w:r>
+      <w:r>
+        <w:rPr>
+          <w:rFonts w:ascii="Calibri" w:hAnsi="Calibri" w:cs="Calibri"/>
+          <w:szCs w:val="28"/>
+          <w:lang w:val="es-419"/>
+        </w:rPr>
+        <w:t>istema integrado de instalaciones físicas, equipos y servicios necesarios para el funcionamiento del establecimiento de alojamiento.</w:t>
+      </w:r>
+    </w:p>
+    <w:p>
+      <w:pPr>
+        <w:rPr>
+          <w:rFonts w:ascii="Calibri" w:hAnsi="Calibri" w:cs="Calibri"/>
+          <w:szCs w:val="28"/>
+          <w:lang w:val="es-419"/>
+        </w:rPr>
+      </w:pPr>
+      <w:r>
+        <w:rPr>
+          <w:rFonts w:ascii="Calibri" w:hAnsi="Calibri" w:cs="Calibri"/>
+          <w:b/>
+          <w:bCs/>
+          <w:szCs w:val="28"/>
+          <w:lang w:val="es-419"/>
+        </w:rPr>
+        <w:t>Política de calidad</w:t>
+      </w:r>
+      <w:r>
+        <w:rPr>
+          <w:rFonts w:ascii="Calibri" w:hAnsi="Calibri" w:cs="Calibri"/>
+          <w:szCs w:val="28"/>
+          <w:lang w:val="es-419"/>
+        </w:rPr>
+        <w:t>: d</w:t>
+      </w:r>
+      <w:r>
+        <w:rPr>
+          <w:rFonts w:ascii="Calibri" w:hAnsi="Calibri" w:cs="Calibri"/>
+          <w:szCs w:val="28"/>
+          <w:lang w:val="es-419"/>
+        </w:rPr>
+        <w:t>eclaración formal de las intenciones y directrices de la organización en materia de calidad, definida por la alta dirección y alineada con la política corporativa.</w:t>
+      </w:r>
+    </w:p>
+    <w:p>
+      <w:pPr>
+        <w:rPr>
+          <w:rFonts w:ascii="Calibri" w:hAnsi="Calibri" w:cs="Calibri"/>
+          <w:szCs w:val="28"/>
+          <w:lang w:val="es-419"/>
+        </w:rPr>
+      </w:pPr>
+      <w:r>
+        <w:rPr>
+          <w:rFonts w:ascii="Calibri" w:hAnsi="Calibri" w:cs="Calibri"/>
+          <w:b/>
+          <w:bCs/>
+          <w:szCs w:val="28"/>
+          <w:lang w:val="es-419"/>
+        </w:rPr>
+        <w:t>Portafolio de servicios</w:t>
+      </w:r>
+      <w:r>
+        <w:rPr>
+          <w:rFonts w:ascii="Calibri" w:hAnsi="Calibri" w:cs="Calibri"/>
+          <w:szCs w:val="28"/>
+          <w:lang w:val="es-419"/>
+        </w:rPr>
+        <w:t>: c</w:t>
+      </w:r>
+      <w:r>
+        <w:rPr>
+          <w:rFonts w:ascii="Calibri" w:hAnsi="Calibri" w:cs="Calibri"/>
+          <w:szCs w:val="28"/>
+          <w:lang w:val="es-419"/>
+        </w:rPr>
+        <w:t>onjunto organizado de servicios básicos y complementarios que ofrece el establecimiento de alojamiento a sus clientes.</w:t>
+      </w:r>
+    </w:p>
+    <w:p>
+      <w:pPr>
+        <w:rPr>
+          <w:rFonts w:ascii="Calibri" w:hAnsi="Calibri" w:cs="Calibri"/>
+          <w:szCs w:val="28"/>
+          <w:lang w:val="es-419"/>
+        </w:rPr>
+      </w:pPr>
+      <w:r>
+        <w:rPr>
+          <w:rFonts w:ascii="Calibri" w:hAnsi="Calibri" w:cs="Calibri"/>
+          <w:b/>
+          <w:bCs/>
+          <w:szCs w:val="28"/>
+          <w:lang w:val="es-419"/>
+        </w:rPr>
+        <w:t>Procedimiento técnico</w:t>
+      </w:r>
+      <w:r>
+        <w:rPr>
+          <w:rFonts w:ascii="Calibri" w:hAnsi="Calibri" w:cs="Calibri"/>
+          <w:szCs w:val="28"/>
+          <w:lang w:val="es-419"/>
+        </w:rPr>
+        <w:t>: s</w:t>
+      </w:r>
+      <w:r>
+        <w:rPr>
+          <w:rFonts w:ascii="Calibri" w:hAnsi="Calibri" w:cs="Calibri"/>
+          <w:szCs w:val="28"/>
+          <w:lang w:val="es-419"/>
+        </w:rPr>
+        <w:t>ecuencia estandarizada de actividades que permite ejecutar un proceso operativo de manera ordenada, eficiente y conforme a normas establecidas.</w:t>
+      </w:r>
+    </w:p>
+    <w:p>
+      <w:pPr>
+        <w:rPr>
+          <w:rFonts w:ascii="Calibri" w:hAnsi="Calibri" w:cs="Calibri"/>
+          <w:szCs w:val="28"/>
+          <w:lang w:val="es-419"/>
+        </w:rPr>
+      </w:pPr>
+      <w:r>
+        <w:rPr>
+          <w:rFonts w:ascii="Calibri" w:hAnsi="Calibri" w:cs="Calibri"/>
+          <w:b/>
+          <w:bCs/>
+          <w:szCs w:val="28"/>
+          <w:lang w:val="es-419"/>
+        </w:rPr>
+        <w:t>Programa de mantenimiento</w:t>
+      </w:r>
+      <w:r>
+        <w:rPr>
+          <w:rFonts w:ascii="Calibri" w:hAnsi="Calibri" w:cs="Calibri"/>
+          <w:szCs w:val="28"/>
+          <w:lang w:val="es-419"/>
+        </w:rPr>
+        <w:t>: p</w:t>
+      </w:r>
+      <w:r>
+        <w:rPr>
+          <w:rFonts w:ascii="Calibri" w:hAnsi="Calibri" w:cs="Calibri"/>
+          <w:szCs w:val="28"/>
+          <w:lang w:val="es-419"/>
+        </w:rPr>
+        <w:t>lanificación de actividades de mantenimiento preventivo y correctivo de las instalaciones físicas durante un periodo determinado.</w:t>
+      </w:r>
+    </w:p>
+    <w:p>
+      <w:pPr>
+        <w:rPr>
+          <w:rFonts w:ascii="Calibri" w:hAnsi="Calibri" w:cs="Calibri"/>
+          <w:szCs w:val="28"/>
+          <w:lang w:val="es-419"/>
+        </w:rPr>
+      </w:pPr>
+      <w:r>
+        <w:rPr>
+          <w:rFonts w:ascii="Calibri" w:hAnsi="Calibri" w:cs="Calibri"/>
+          <w:b/>
+          <w:bCs/>
+          <w:szCs w:val="28"/>
+          <w:lang w:val="es-419"/>
+        </w:rPr>
+        <w:t>Protocolo de atención al cliente</w:t>
+      </w:r>
+      <w:r>
+        <w:rPr>
+          <w:rFonts w:ascii="Calibri" w:hAnsi="Calibri" w:cs="Calibri"/>
+          <w:szCs w:val="28"/>
+          <w:lang w:val="es-419"/>
+        </w:rPr>
+        <w:t>: l</w:t>
+      </w:r>
+      <w:r>
+        <w:rPr>
+          <w:rFonts w:ascii="Calibri" w:hAnsi="Calibri" w:cs="Calibri"/>
+          <w:szCs w:val="28"/>
+          <w:lang w:val="es-419"/>
+        </w:rPr>
+        <w:t>ineamientos que orientan la conducta, la comunicación y el servicio del personal hacia el huésped, asegurando atención uniforme y de calidad.</w:t>
+      </w:r>
+    </w:p>
+    <w:p>
+      <w:pPr>
+        <w:rPr>
+          <w:rFonts w:ascii="Calibri" w:hAnsi="Calibri" w:cs="Calibri"/>
+          <w:szCs w:val="28"/>
+          <w:lang w:val="es-419"/>
+        </w:rPr>
+      </w:pPr>
+      <w:r>
+        <w:rPr>
+          <w:rFonts w:ascii="Calibri" w:hAnsi="Calibri" w:cs="Calibri"/>
+          <w:b/>
+          <w:bCs/>
+          <w:szCs w:val="28"/>
+          <w:lang w:val="es-419"/>
+        </w:rPr>
+        <w:lastRenderedPageBreak/>
+        <w:t>Recepción</w:t>
+      </w:r>
+      <w:r>
+        <w:rPr>
+          <w:rFonts w:ascii="Calibri" w:hAnsi="Calibri" w:cs="Calibri"/>
+          <w:szCs w:val="28"/>
+          <w:lang w:val="es-419"/>
+        </w:rPr>
+        <w:t>: á</w:t>
+      </w:r>
+      <w:r>
+        <w:rPr>
+          <w:rFonts w:ascii="Calibri" w:hAnsi="Calibri" w:cs="Calibri"/>
+          <w:szCs w:val="28"/>
+          <w:lang w:val="es-419"/>
+        </w:rPr>
+        <w:t>rea estratégica del hotel encargada del registro de huéspedes, la gestión de reservas, la atención al cliente y el control de la información operativa.</w:t>
+      </w:r>
+    </w:p>
+    <w:p>
+      <w:pPr>
+        <w:rPr>
+          <w:rFonts w:ascii="Calibri" w:hAnsi="Calibri" w:cs="Calibri"/>
+          <w:szCs w:val="28"/>
+          <w:lang w:val="es-419"/>
+        </w:rPr>
+      </w:pPr>
+      <w:r>
+        <w:rPr>
+          <w:rFonts w:ascii="Calibri" w:hAnsi="Calibri" w:cs="Calibri"/>
+          <w:b/>
+          <w:bCs/>
+          <w:szCs w:val="28"/>
+          <w:lang w:val="es-419"/>
+        </w:rPr>
+        <w:t>Registros de mantenimiento</w:t>
+      </w:r>
+      <w:r>
+        <w:rPr>
+          <w:rFonts w:ascii="Calibri" w:hAnsi="Calibri" w:cs="Calibri"/>
+          <w:szCs w:val="28"/>
+          <w:lang w:val="es-419"/>
+        </w:rPr>
+        <w:t>: d</w:t>
+      </w:r>
+      <w:r>
+        <w:rPr>
+          <w:rFonts w:ascii="Calibri" w:hAnsi="Calibri" w:cs="Calibri"/>
+          <w:szCs w:val="28"/>
+          <w:lang w:val="es-419"/>
+        </w:rPr>
+        <w:t>ocumentos que evidencian las actividades realizadas y los resultados obtenidos en los procesos de mantenimiento de las instalaciones.</w:t>
+      </w:r>
+    </w:p>
+    <w:p>
+      <w:pPr>
+        <w:rPr>
+          <w:rFonts w:ascii="Calibri" w:hAnsi="Calibri" w:cs="Calibri"/>
+          <w:szCs w:val="28"/>
+          <w:lang w:val="es-419"/>
+        </w:rPr>
+      </w:pPr>
+      <w:r>
+        <w:rPr>
+          <w:rFonts w:ascii="Calibri" w:hAnsi="Calibri" w:cs="Calibri"/>
+          <w:b/>
+          <w:bCs/>
+          <w:szCs w:val="28"/>
+          <w:lang w:val="es-419"/>
+        </w:rPr>
+        <w:t>Reserva garantizada</w:t>
+      </w:r>
+      <w:r>
+        <w:rPr>
+          <w:rFonts w:ascii="Calibri" w:hAnsi="Calibri" w:cs="Calibri"/>
+          <w:szCs w:val="28"/>
+          <w:lang w:val="es-419"/>
+        </w:rPr>
+        <w:t>: e</w:t>
+      </w:r>
+      <w:r>
+        <w:rPr>
+          <w:rFonts w:ascii="Calibri" w:hAnsi="Calibri" w:cs="Calibri"/>
+          <w:szCs w:val="28"/>
+          <w:lang w:val="es-419"/>
+        </w:rPr>
+        <w:t>stado de una reserva que asegura la disponibilidad de la habitación mediante un medio de pago o garantía aceptada por el establecimiento.</w:t>
+      </w:r>
+    </w:p>
+    <w:p>
+      <w:pPr>
+        <w:rPr>
+          <w:rFonts w:ascii="Calibri" w:hAnsi="Calibri" w:cs="Calibri"/>
+          <w:szCs w:val="28"/>
+          <w:lang w:val="es-419"/>
+        </w:rPr>
+      </w:pPr>
+      <w:r>
+        <w:rPr>
+          <w:rFonts w:ascii="Calibri" w:hAnsi="Calibri" w:cs="Calibri"/>
+          <w:b/>
+          <w:bCs/>
+          <w:szCs w:val="28"/>
+          <w:lang w:val="es-419"/>
+        </w:rPr>
+        <w:t>Reserva hotelera</w:t>
+      </w:r>
+      <w:r>
+        <w:rPr>
+          <w:rFonts w:ascii="Calibri" w:hAnsi="Calibri" w:cs="Calibri"/>
+          <w:szCs w:val="28"/>
+          <w:lang w:val="es-419"/>
+        </w:rPr>
+        <w:t>: c</w:t>
+      </w:r>
+      <w:r>
+        <w:rPr>
+          <w:rFonts w:ascii="Calibri" w:hAnsi="Calibri" w:cs="Calibri"/>
+          <w:szCs w:val="28"/>
+          <w:lang w:val="es-419"/>
+        </w:rPr>
+        <w:t>ompromiso mediante el cual el establecimiento retiene una o varias habitaciones para una fecha determinada, bajo condiciones específicas de pago y cancelación.</w:t>
+      </w:r>
+    </w:p>
+    <w:p>
+      <w:pPr>
+        <w:rPr>
+          <w:rFonts w:ascii="Calibri" w:hAnsi="Calibri" w:cs="Calibri"/>
+          <w:szCs w:val="28"/>
+          <w:lang w:val="es-419"/>
+        </w:rPr>
+      </w:pPr>
       <w:r>
         <w:rPr>
           <w:rStyle w:val="Extranjerismo"/>
@@ -7675,8 +8375,33 @@
           <w:bCs/>
           <w:lang w:val="es-419"/>
         </w:rPr>
-        <w:t>-in</w:t>
-      </w:r>
+        <w:t>Room service</w:t>
+      </w:r>
+      <w:r>
+        <w:rPr>
+          <w:rFonts w:ascii="Calibri" w:hAnsi="Calibri" w:cs="Calibri"/>
+          <w:szCs w:val="28"/>
+          <w:lang w:val="es-419"/>
+        </w:rPr>
+        <w:t>: s</w:t>
+      </w:r>
+      <w:r>
+        <w:rPr>
+          <w:rFonts w:ascii="Calibri" w:hAnsi="Calibri" w:cs="Calibri"/>
+          <w:szCs w:val="28"/>
+          <w:lang w:val="es-419"/>
+        </w:rPr>
+        <w:t>ervicio de alimentación proporcionado directamente en la habitación del huésped.</w:t>
+      </w:r>
+    </w:p>
+    <w:p>
+      <w:pPr>
+        <w:rPr>
+          <w:rFonts w:ascii="Calibri" w:hAnsi="Calibri" w:cs="Calibri"/>
+          <w:szCs w:val="28"/>
+          <w:lang w:val="es-419"/>
+        </w:rPr>
+      </w:pPr>
       <w:r>
         <w:rPr>
           <w:rFonts w:ascii="Calibri" w:hAnsi="Calibri" w:cs="Calibri"/>
@@ -7685,7 +8410,7 @@
           <w:szCs w:val="28"/>
           <w:lang w:val="es-419"/>
         </w:rPr>
-        <w:t>):</w:t>
+        <w:t>Señalización</w:t>
       </w:r>
       <w:r>
         <w:rPr>
@@ -7693,7 +8418,7 @@
           <w:szCs w:val="28"/>
           <w:lang w:val="es-419"/>
         </w:rPr>
-        <w:t xml:space="preserve"> s</w:t>
+        <w:t>: c</w:t>
       </w:r>
       <w:r>
         <w:rPr>
@@ -7701,7 +8426,7 @@
           <w:szCs w:val="28"/>
           <w:lang w:val="es-419"/>
         </w:rPr>
-        <w:t>ervicio que permite el ingreso del huésped antes de la hora establecida, sujeto a disponibilidad y a las políticas del establecimiento.</w:t>
+        <w:t>onjunto de indicaciones visuales que orientan y regulan el comportamiento de las personas dentro del establecimiento.</w:t>
       </w:r>
     </w:p>
     <w:p>
@@ -7712,7 +8437,6 @@
           <w:lang w:val="es-419"/>
         </w:rPr>
       </w:pPr>
-      <w:proofErr w:type="spellStart"/>
       <w:r>
         <w:rPr>
           <w:rStyle w:val="Extranjerismo"/>
@@ -7720,46 +8444,41 @@
           <w:bCs/>
           <w:lang w:val="es-419"/>
         </w:rPr>
-        <w:t>Check-out</w:t>
-      </w:r>
-      <w:proofErr w:type="spellEnd"/>
-      <w:r>
-        <w:rPr>
-          <w:rFonts w:ascii="Calibri" w:hAnsi="Calibri" w:cs="Calibri"/>
-          <w:szCs w:val="28"/>
-          <w:lang w:val="es-419"/>
-        </w:rPr>
-        <w:t>: p</w:t>
-      </w:r>
-      <w:r>
-        <w:rPr>
-          <w:rFonts w:ascii="Calibri" w:hAnsi="Calibri" w:cs="Calibri"/>
-          <w:szCs w:val="28"/>
-          <w:lang w:val="es-419"/>
-        </w:rPr>
-        <w:t>roceso mediante el cual el huésped entrega la habitación ocupada, se revisa y liquida la cuenta por los servicios consumidos y se formaliza la salida del establecimiento.</w:t>
-      </w:r>
-    </w:p>
-    <w:p>
-      <w:pPr>
-        <w:rPr>
-          <w:rFonts w:ascii="Calibri" w:hAnsi="Calibri" w:cs="Calibri"/>
-          <w:szCs w:val="28"/>
-          <w:lang w:val="es-419"/>
-        </w:rPr>
-      </w:pPr>
-      <w:proofErr w:type="spellStart"/>
+        <w:t>Spa</w:t>
+      </w:r>
       <w:r>
         <w:rPr>
           <w:rStyle w:val="Extranjerismo"/>
           <w:b/>
           <w:bCs/>
-          <w:lang w:val="es-419"/>
-        </w:rPr>
-        <w:lastRenderedPageBreak/>
-        <w:t>Check-out</w:t>
-      </w:r>
-      <w:proofErr w:type="spellEnd"/>
+        </w:rPr>
+        <w:t>:</w:t>
+      </w:r>
+      <w:r>
+        <w:rPr>
+          <w:rFonts w:ascii="Calibri" w:hAnsi="Calibri" w:cs="Calibri"/>
+          <w:szCs w:val="28"/>
+          <w:lang w:val="es-419"/>
+        </w:rPr>
+        <w:t xml:space="preserve"> i</w:t>
+      </w:r>
+      <w:r>
+        <w:rPr>
+          <w:rFonts w:ascii="Calibri" w:hAnsi="Calibri" w:cs="Calibri"/>
+          <w:szCs w:val="28"/>
+          <w:lang w:val="es-419"/>
+        </w:rPr>
+        <w:t>nfraestructura destinada al bienestar físico y mental, que utiliza elementos naturales o tratamientos especializados como servicio complementario del hotel.</w:t>
+      </w:r>
+    </w:p>
+    <w:p>
+      <w:pPr>
+        <w:rPr>
+          <w:rFonts w:ascii="Calibri" w:hAnsi="Calibri" w:cs="Calibri"/>
+          <w:szCs w:val="28"/>
+          <w:lang w:val="es-419"/>
+        </w:rPr>
+      </w:pPr>
       <w:r>
         <w:rPr>
           <w:rFonts w:ascii="Calibri" w:hAnsi="Calibri" w:cs="Calibri"/>
@@ -7768,8 +8487,118 @@
           <w:szCs w:val="28"/>
           <w:lang w:val="es-419"/>
         </w:rPr>
-        <w:t xml:space="preserve"> tardío (</w:t>
-      </w:r>
+        <w:t>Tarifa hotelera</w:t>
+      </w:r>
+      <w:r>
+        <w:rPr>
+          <w:rFonts w:ascii="Calibri" w:hAnsi="Calibri" w:cs="Calibri"/>
+          <w:szCs w:val="28"/>
+          <w:lang w:val="es-419"/>
+        </w:rPr>
+        <w:t>: v</w:t>
+      </w:r>
+      <w:r>
+        <w:rPr>
+          <w:rFonts w:ascii="Calibri" w:hAnsi="Calibri" w:cs="Calibri"/>
+          <w:szCs w:val="28"/>
+          <w:lang w:val="es-419"/>
+        </w:rPr>
+        <w:t>alor económico asignado a los servicios de alojamiento y complementarios, definido según políticas internas, temporada y tipo de cliente.</w:t>
+      </w:r>
+    </w:p>
+    <w:p>
+      <w:pPr>
+        <w:rPr>
+          <w:rFonts w:ascii="Calibri" w:hAnsi="Calibri" w:cs="Calibri"/>
+          <w:szCs w:val="28"/>
+          <w:lang w:val="es-419"/>
+        </w:rPr>
+      </w:pPr>
+      <w:r>
+        <w:rPr>
+          <w:rFonts w:ascii="Calibri" w:hAnsi="Calibri" w:cs="Calibri"/>
+          <w:b/>
+          <w:bCs/>
+          <w:szCs w:val="28"/>
+          <w:lang w:val="es-419"/>
+        </w:rPr>
+        <w:t>Tipología de habitaciones</w:t>
+      </w:r>
+      <w:r>
+        <w:rPr>
+          <w:rFonts w:ascii="Calibri" w:hAnsi="Calibri" w:cs="Calibri"/>
+          <w:szCs w:val="28"/>
+          <w:lang w:val="es-419"/>
+        </w:rPr>
+        <w:t>: c</w:t>
+      </w:r>
+      <w:r>
+        <w:rPr>
+          <w:rFonts w:ascii="Calibri" w:hAnsi="Calibri" w:cs="Calibri"/>
+          <w:szCs w:val="28"/>
+          <w:lang w:val="es-419"/>
+        </w:rPr>
+        <w:t>lasificación de las habitaciones según características como tamaño, tipo de cama, capacidad y nivel de</w:t>
+      </w:r>
+      <w:r>
+        <w:rPr>
+          <w:rStyle w:val="Extranjerismo"/>
+          <w:lang w:val="es-419"/>
+        </w:rPr>
+        <w:t xml:space="preserve"> confort</w:t>
+      </w:r>
+      <w:r>
+        <w:rPr>
+          <w:rFonts w:ascii="Calibri" w:hAnsi="Calibri" w:cs="Calibri"/>
+          <w:szCs w:val="28"/>
+          <w:lang w:val="es-419"/>
+        </w:rPr>
+        <w:t>.</w:t>
+      </w:r>
+    </w:p>
+    <w:p>
+      <w:pPr>
+        <w:rPr>
+          <w:rFonts w:ascii="Calibri" w:hAnsi="Calibri" w:cs="Calibri"/>
+          <w:szCs w:val="28"/>
+          <w:lang w:val="es-419"/>
+        </w:rPr>
+      </w:pPr>
+      <w:r>
+        <w:rPr>
+          <w:rFonts w:ascii="Calibri" w:hAnsi="Calibri" w:cs="Calibri"/>
+          <w:b/>
+          <w:bCs/>
+          <w:szCs w:val="28"/>
+          <w:lang w:val="es-419"/>
+        </w:rPr>
+        <w:t>Turno operativo</w:t>
+      </w:r>
+      <w:r>
+        <w:rPr>
+          <w:rFonts w:ascii="Calibri" w:hAnsi="Calibri" w:cs="Calibri"/>
+          <w:szCs w:val="28"/>
+          <w:lang w:val="es-419"/>
+        </w:rPr>
+        <w:t>: f</w:t>
+      </w:r>
+      <w:r>
+        <w:rPr>
+          <w:rFonts w:ascii="Calibri" w:hAnsi="Calibri" w:cs="Calibri"/>
+          <w:szCs w:val="28"/>
+          <w:lang w:val="es-419"/>
+        </w:rPr>
+        <w:t>ranja horaria en la cual el personal desarrolla sus funciones, garantizando la continuidad del servicio hotelero.</w:t>
+      </w:r>
+    </w:p>
+    <w:p>
+      <w:pPr>
+        <w:rPr>
+          <w:rFonts w:ascii="Calibri" w:hAnsi="Calibri" w:cs="Calibri"/>
+          <w:szCs w:val="28"/>
+          <w:lang w:val="es-419"/>
+        </w:rPr>
+      </w:pPr>
       <w:r>
         <w:rPr>
           <w:rStyle w:val="Extranjerismo"/>
@@ -7777,1072 +8606,9 @@
           <w:bCs/>
           <w:lang w:val="es-419"/>
         </w:rPr>
-        <w:t xml:space="preserve">Late </w:t>
-      </w:r>
-      <w:proofErr w:type="spellStart"/>
-      <w:r>
-        <w:rPr>
-          <w:rStyle w:val="Extranjerismo"/>
-          <w:b/>
-          <w:bCs/>
-          <w:lang w:val="es-419"/>
-        </w:rPr>
-        <w:t>check-out</w:t>
-      </w:r>
-      <w:proofErr w:type="spellEnd"/>
-      <w:r>
-        <w:rPr>
-          <w:rFonts w:ascii="Calibri" w:hAnsi="Calibri" w:cs="Calibri"/>
-          <w:b/>
-          <w:bCs/>
-          <w:szCs w:val="28"/>
-          <w:lang w:val="es-419"/>
-        </w:rPr>
-        <w:t>):</w:t>
-      </w:r>
-      <w:r>
-        <w:rPr>
-          <w:rFonts w:ascii="Calibri" w:hAnsi="Calibri" w:cs="Calibri"/>
-          <w:szCs w:val="28"/>
-          <w:lang w:val="es-419"/>
-        </w:rPr>
-        <w:t xml:space="preserve"> s</w:t>
-      </w:r>
-      <w:r>
-        <w:rPr>
-          <w:rFonts w:ascii="Calibri" w:hAnsi="Calibri" w:cs="Calibri"/>
-          <w:szCs w:val="28"/>
-          <w:lang w:val="es-419"/>
-        </w:rPr>
-        <w:t>ervicio que autoriza al huésped a permanecer en la habitación después de la hora de salida establecida, de acuerdo con la disponibilidad y las condiciones del hotel.</w:t>
-      </w:r>
-    </w:p>
-    <w:p>
-      <w:pPr>
-        <w:rPr>
-          <w:rFonts w:ascii="Calibri" w:hAnsi="Calibri" w:cs="Calibri"/>
-          <w:szCs w:val="28"/>
-          <w:lang w:val="es-419"/>
-        </w:rPr>
-      </w:pPr>
-      <w:r>
-        <w:rPr>
-          <w:rFonts w:ascii="Calibri" w:hAnsi="Calibri" w:cs="Calibri"/>
-          <w:b/>
-          <w:bCs/>
-          <w:szCs w:val="28"/>
-          <w:lang w:val="es-419"/>
-        </w:rPr>
-        <w:t>Conserjería</w:t>
-      </w:r>
-      <w:r>
-        <w:rPr>
-          <w:rFonts w:ascii="Calibri" w:hAnsi="Calibri" w:cs="Calibri"/>
-          <w:szCs w:val="28"/>
-          <w:lang w:val="es-419"/>
-        </w:rPr>
-        <w:t>: á</w:t>
-      </w:r>
-      <w:r>
-        <w:rPr>
-          <w:rFonts w:ascii="Calibri" w:hAnsi="Calibri" w:cs="Calibri"/>
-          <w:szCs w:val="28"/>
-          <w:lang w:val="es-419"/>
-        </w:rPr>
-        <w:t>rea del hotel encargada de ofrecer información, asistencia y servicios personalizados al huésped, contribuyendo a mejorar su experiencia durante la estadía.</w:t>
-      </w:r>
-    </w:p>
-    <w:p>
-      <w:pPr>
-        <w:rPr>
-          <w:rFonts w:ascii="Calibri" w:hAnsi="Calibri" w:cs="Calibri"/>
-          <w:szCs w:val="28"/>
-          <w:lang w:val="es-419"/>
-        </w:rPr>
-      </w:pPr>
-      <w:r>
-        <w:rPr>
-          <w:rFonts w:ascii="Calibri" w:hAnsi="Calibri" w:cs="Calibri"/>
-          <w:b/>
-          <w:bCs/>
-          <w:szCs w:val="28"/>
-          <w:lang w:val="es-419"/>
-        </w:rPr>
-        <w:t>Disponibilidad:</w:t>
-      </w:r>
-      <w:r>
-        <w:rPr>
-          <w:rFonts w:ascii="Calibri" w:hAnsi="Calibri" w:cs="Calibri"/>
-          <w:szCs w:val="28"/>
-          <w:lang w:val="es-419"/>
-        </w:rPr>
-        <w:t xml:space="preserve"> c</w:t>
-      </w:r>
-      <w:r>
-        <w:rPr>
-          <w:rFonts w:ascii="Calibri" w:hAnsi="Calibri" w:cs="Calibri"/>
-          <w:szCs w:val="28"/>
-          <w:lang w:val="es-419"/>
-        </w:rPr>
-        <w:t>apacidad real del establecimiento para ofrecer habitaciones o servicios en una fecha determinada, de acuerdo con el nivel de ocupación y las reservas existentes.</w:t>
-      </w:r>
-    </w:p>
-    <w:p>
-      <w:pPr>
-        <w:rPr>
-          <w:rFonts w:ascii="Calibri" w:hAnsi="Calibri" w:cs="Calibri"/>
-          <w:szCs w:val="28"/>
-          <w:lang w:val="es-419"/>
-        </w:rPr>
-      </w:pPr>
-      <w:r>
-        <w:rPr>
-          <w:rFonts w:ascii="Calibri" w:hAnsi="Calibri" w:cs="Calibri"/>
-          <w:b/>
-          <w:bCs/>
-          <w:szCs w:val="28"/>
-          <w:lang w:val="es-419"/>
-        </w:rPr>
-        <w:t>Estancia</w:t>
-      </w:r>
-      <w:r>
-        <w:rPr>
-          <w:rFonts w:ascii="Calibri" w:hAnsi="Calibri" w:cs="Calibri"/>
-          <w:szCs w:val="28"/>
-          <w:lang w:val="es-419"/>
-        </w:rPr>
-        <w:t>: p</w:t>
-      </w:r>
-      <w:r>
-        <w:rPr>
-          <w:rFonts w:ascii="Calibri" w:hAnsi="Calibri" w:cs="Calibri"/>
-          <w:szCs w:val="28"/>
-          <w:lang w:val="es-419"/>
-        </w:rPr>
-        <w:t xml:space="preserve">eriodo comprendido entre el </w:t>
-      </w:r>
-      <w:proofErr w:type="spellStart"/>
-      <w:r>
-        <w:rPr>
-          <w:rStyle w:val="Extranjerismo"/>
-          <w:lang w:val="es-419"/>
-        </w:rPr>
-        <w:t>check</w:t>
-      </w:r>
-      <w:proofErr w:type="spellEnd"/>
-      <w:r>
-        <w:rPr>
-          <w:rStyle w:val="Extranjerismo"/>
-          <w:lang w:val="es-419"/>
-        </w:rPr>
-        <w:t>-in</w:t>
-      </w:r>
-      <w:r>
-        <w:rPr>
-          <w:rFonts w:ascii="Calibri" w:hAnsi="Calibri" w:cs="Calibri"/>
-          <w:szCs w:val="28"/>
-          <w:lang w:val="es-419"/>
-        </w:rPr>
-        <w:t xml:space="preserve"> y el </w:t>
-      </w:r>
-      <w:proofErr w:type="spellStart"/>
-      <w:r>
-        <w:rPr>
-          <w:rStyle w:val="Extranjerismo"/>
-          <w:lang w:val="es-419"/>
-        </w:rPr>
-        <w:t>check-out</w:t>
-      </w:r>
-      <w:proofErr w:type="spellEnd"/>
-      <w:r>
-        <w:rPr>
-          <w:rFonts w:ascii="Calibri" w:hAnsi="Calibri" w:cs="Calibri"/>
-          <w:szCs w:val="28"/>
-          <w:lang w:val="es-419"/>
-        </w:rPr>
-        <w:t>, durante el cual el huésped permanece alojado en el establecimiento.</w:t>
-      </w:r>
-    </w:p>
-    <w:p>
-      <w:pPr>
-        <w:rPr>
-          <w:rFonts w:ascii="Calibri" w:hAnsi="Calibri" w:cs="Calibri"/>
-          <w:szCs w:val="28"/>
-          <w:lang w:val="es-419"/>
-        </w:rPr>
-      </w:pPr>
-      <w:proofErr w:type="spellStart"/>
-      <w:r>
-        <w:rPr>
-          <w:rStyle w:val="Extranjerismo"/>
-          <w:b/>
-          <w:bCs/>
-          <w:lang w:val="es-419"/>
-        </w:rPr>
-        <w:t>Housekeeping</w:t>
-      </w:r>
-      <w:proofErr w:type="spellEnd"/>
-      <w:r>
-        <w:rPr>
-          <w:rFonts w:ascii="Calibri" w:hAnsi="Calibri" w:cs="Calibri"/>
-          <w:szCs w:val="28"/>
-          <w:lang w:val="es-419"/>
-        </w:rPr>
-        <w:t>: d</w:t>
-      </w:r>
-      <w:r>
-        <w:rPr>
-          <w:rFonts w:ascii="Calibri" w:hAnsi="Calibri" w:cs="Calibri"/>
-          <w:szCs w:val="28"/>
-          <w:lang w:val="es-419"/>
-        </w:rPr>
-        <w:t>epartamento operativo responsable de la limpieza, orden, presentación y mantenimiento básico de habitaciones y áreas comunes del hotel.</w:t>
-      </w:r>
-    </w:p>
-    <w:p>
-      <w:pPr>
-        <w:rPr>
-          <w:rFonts w:ascii="Calibri" w:hAnsi="Calibri" w:cs="Calibri"/>
-          <w:szCs w:val="28"/>
-          <w:lang w:val="es-419"/>
-        </w:rPr>
-      </w:pPr>
-      <w:r>
-        <w:rPr>
-          <w:rFonts w:ascii="Calibri" w:hAnsi="Calibri" w:cs="Calibri"/>
-          <w:b/>
-          <w:bCs/>
-          <w:szCs w:val="28"/>
-          <w:lang w:val="es-419"/>
-        </w:rPr>
-        <w:t>Inventario hotelero</w:t>
-      </w:r>
-      <w:r>
-        <w:rPr>
-          <w:rFonts w:ascii="Calibri" w:hAnsi="Calibri" w:cs="Calibri"/>
-          <w:szCs w:val="28"/>
-          <w:lang w:val="es-419"/>
-        </w:rPr>
-        <w:t>: c</w:t>
-      </w:r>
-      <w:r>
-        <w:rPr>
-          <w:rFonts w:ascii="Calibri" w:hAnsi="Calibri" w:cs="Calibri"/>
-          <w:szCs w:val="28"/>
-          <w:lang w:val="es-419"/>
-        </w:rPr>
-        <w:t>onjunto de habitaciones, servicios y recursos físicos disponibles para la operación y comercialización del establecimiento de alojamiento.</w:t>
-      </w:r>
-    </w:p>
-    <w:p>
-      <w:pPr>
-        <w:rPr>
-          <w:rFonts w:ascii="Calibri" w:hAnsi="Calibri" w:cs="Calibri"/>
-          <w:szCs w:val="28"/>
-          <w:lang w:val="es-419"/>
-        </w:rPr>
-      </w:pPr>
-      <w:r>
-        <w:rPr>
-          <w:rFonts w:ascii="Calibri" w:hAnsi="Calibri" w:cs="Calibri"/>
-          <w:b/>
-          <w:bCs/>
-          <w:szCs w:val="28"/>
-          <w:lang w:val="es-419"/>
-        </w:rPr>
-        <w:t>Norma de competencia</w:t>
-      </w:r>
-      <w:r>
-        <w:rPr>
-          <w:rFonts w:ascii="Calibri" w:hAnsi="Calibri" w:cs="Calibri"/>
-          <w:szCs w:val="28"/>
-          <w:lang w:val="es-419"/>
-        </w:rPr>
-        <w:t>: c</w:t>
-      </w:r>
-      <w:r>
-        <w:rPr>
-          <w:rFonts w:ascii="Calibri" w:hAnsi="Calibri" w:cs="Calibri"/>
-          <w:szCs w:val="28"/>
-          <w:lang w:val="es-419"/>
-        </w:rPr>
-        <w:t>onjunto de funciones laborales que describen el desempeño esperado en un proceso de trabajo, con valor y significado para el ejercicio profesional.</w:t>
-      </w:r>
-    </w:p>
-    <w:p>
-      <w:pPr>
-        <w:rPr>
-          <w:rFonts w:ascii="Calibri" w:hAnsi="Calibri" w:cs="Calibri"/>
-          <w:szCs w:val="28"/>
-          <w:lang w:val="es-419"/>
-        </w:rPr>
-      </w:pPr>
-      <w:r>
-        <w:rPr>
-          <w:rFonts w:ascii="Calibri" w:hAnsi="Calibri" w:cs="Calibri"/>
-          <w:b/>
-          <w:bCs/>
-          <w:szCs w:val="28"/>
-          <w:lang w:val="es-419"/>
-        </w:rPr>
-        <w:t>Objetivos de calidad</w:t>
-      </w:r>
-      <w:r>
-        <w:rPr>
-          <w:rFonts w:ascii="Calibri" w:hAnsi="Calibri" w:cs="Calibri"/>
-          <w:szCs w:val="28"/>
-          <w:lang w:val="es-419"/>
-        </w:rPr>
-        <w:t>: r</w:t>
-      </w:r>
-      <w:r>
-        <w:rPr>
-          <w:rFonts w:ascii="Calibri" w:hAnsi="Calibri" w:cs="Calibri"/>
-          <w:szCs w:val="28"/>
-          <w:lang w:val="es-419"/>
-        </w:rPr>
-        <w:t>esultados esperados relacionados con la calidad del servicio, definidos a partir de la política de calidad de la organización.</w:t>
-      </w:r>
-    </w:p>
-    <w:p>
-      <w:pPr>
-        <w:rPr>
-          <w:rFonts w:ascii="Calibri" w:hAnsi="Calibri" w:cs="Calibri"/>
-          <w:szCs w:val="28"/>
-          <w:lang w:val="es-419"/>
-        </w:rPr>
-      </w:pPr>
-      <w:r>
-        <w:rPr>
-          <w:rFonts w:ascii="Calibri" w:hAnsi="Calibri" w:cs="Calibri"/>
-          <w:b/>
-          <w:bCs/>
-          <w:szCs w:val="28"/>
-          <w:lang w:val="es-419"/>
-        </w:rPr>
-        <w:t>Ocupación</w:t>
-      </w:r>
-      <w:r>
-        <w:rPr>
-          <w:rFonts w:ascii="Calibri" w:hAnsi="Calibri" w:cs="Calibri"/>
-          <w:szCs w:val="28"/>
-          <w:lang w:val="es-419"/>
-        </w:rPr>
-        <w:t>: i</w:t>
-      </w:r>
-      <w:r>
-        <w:rPr>
-          <w:rFonts w:ascii="Calibri" w:hAnsi="Calibri" w:cs="Calibri"/>
-          <w:szCs w:val="28"/>
-          <w:lang w:val="es-419"/>
-        </w:rPr>
-        <w:t>ndicador que refleja el uso efectivo de las habitaciones disponibles durante un periodo determinado, generalmente expresado en porcentaje.</w:t>
-      </w:r>
-    </w:p>
-    <w:p>
-      <w:pPr>
-        <w:rPr>
-          <w:rFonts w:ascii="Calibri" w:hAnsi="Calibri" w:cs="Calibri"/>
-          <w:szCs w:val="28"/>
-          <w:lang w:val="es-419"/>
-        </w:rPr>
-      </w:pPr>
-      <w:r>
-        <w:rPr>
-          <w:rStyle w:val="Extranjerismo"/>
-          <w:b/>
-          <w:bCs/>
-          <w:lang w:val="es-419"/>
-        </w:rPr>
-        <w:lastRenderedPageBreak/>
-        <w:t>Par stock</w:t>
-      </w:r>
-      <w:r>
-        <w:rPr>
-          <w:rFonts w:ascii="Calibri" w:hAnsi="Calibri" w:cs="Calibri"/>
-          <w:b/>
-          <w:bCs/>
-          <w:szCs w:val="28"/>
-          <w:lang w:val="es-419"/>
-        </w:rPr>
-        <w:t>:</w:t>
-      </w:r>
-      <w:r>
-        <w:rPr>
-          <w:rFonts w:ascii="Calibri" w:hAnsi="Calibri" w:cs="Calibri"/>
-          <w:szCs w:val="28"/>
-          <w:lang w:val="es-419"/>
-        </w:rPr>
-        <w:t xml:space="preserve"> c</w:t>
-      </w:r>
-      <w:r>
-        <w:rPr>
-          <w:rFonts w:ascii="Calibri" w:hAnsi="Calibri" w:cs="Calibri"/>
-          <w:szCs w:val="28"/>
-          <w:lang w:val="es-419"/>
-        </w:rPr>
-        <w:t>antidad mínima de elementos operativos (lencería, vajilla, utensilios, entre otros) necesarios para garantizar la continuidad del servicio según la capacidad instalada.</w:t>
-      </w:r>
-    </w:p>
-    <w:p>
-      <w:pPr>
-        <w:rPr>
-          <w:rFonts w:ascii="Calibri" w:hAnsi="Calibri" w:cs="Calibri"/>
-          <w:szCs w:val="28"/>
-          <w:lang w:val="es-419"/>
-        </w:rPr>
-      </w:pPr>
-      <w:r>
-        <w:rPr>
-          <w:rFonts w:ascii="Calibri" w:hAnsi="Calibri" w:cs="Calibri"/>
-          <w:b/>
-          <w:bCs/>
-          <w:szCs w:val="28"/>
-          <w:lang w:val="es-419"/>
-        </w:rPr>
-        <w:t>Plan de emergencia</w:t>
-      </w:r>
-      <w:r>
-        <w:rPr>
-          <w:rFonts w:ascii="Calibri" w:hAnsi="Calibri" w:cs="Calibri"/>
-          <w:szCs w:val="28"/>
-          <w:lang w:val="es-419"/>
-        </w:rPr>
-        <w:t>: c</w:t>
-      </w:r>
-      <w:r>
-        <w:rPr>
-          <w:rFonts w:ascii="Calibri" w:hAnsi="Calibri" w:cs="Calibri"/>
-          <w:szCs w:val="28"/>
-          <w:lang w:val="es-419"/>
-        </w:rPr>
-        <w:t>onjunto de medidas y procedimientos destinados a salvaguardar la vida de las personas y los bienes del establecimiento ante situaciones de riesgo o desastre.</w:t>
-      </w:r>
-    </w:p>
-    <w:p>
-      <w:pPr>
-        <w:rPr>
-          <w:rFonts w:ascii="Calibri" w:hAnsi="Calibri" w:cs="Calibri"/>
-          <w:szCs w:val="28"/>
-          <w:lang w:val="es-419"/>
-        </w:rPr>
-      </w:pPr>
-      <w:r>
-        <w:rPr>
-          <w:rFonts w:ascii="Calibri" w:hAnsi="Calibri" w:cs="Calibri"/>
-          <w:b/>
-          <w:bCs/>
-          <w:szCs w:val="28"/>
-          <w:lang w:val="es-419"/>
-        </w:rPr>
-        <w:t>Planta</w:t>
-      </w:r>
-      <w:r>
-        <w:rPr>
-          <w:rFonts w:ascii="Calibri" w:hAnsi="Calibri" w:cs="Calibri"/>
-          <w:szCs w:val="28"/>
-          <w:lang w:val="es-419"/>
-        </w:rPr>
-        <w:t>: s</w:t>
-      </w:r>
-      <w:r>
-        <w:rPr>
-          <w:rFonts w:ascii="Calibri" w:hAnsi="Calibri" w:cs="Calibri"/>
-          <w:szCs w:val="28"/>
-          <w:lang w:val="es-419"/>
-        </w:rPr>
-        <w:t>istema integrado de instalaciones físicas, equipos y servicios necesarios para el funcionamiento del establecimiento de alojamiento.</w:t>
-      </w:r>
-    </w:p>
-    <w:p>
-      <w:pPr>
-        <w:rPr>
-          <w:rFonts w:ascii="Calibri" w:hAnsi="Calibri" w:cs="Calibri"/>
-          <w:szCs w:val="28"/>
-          <w:lang w:val="es-419"/>
-        </w:rPr>
-      </w:pPr>
-      <w:r>
-        <w:rPr>
-          <w:rFonts w:ascii="Calibri" w:hAnsi="Calibri" w:cs="Calibri"/>
-          <w:b/>
-          <w:bCs/>
-          <w:szCs w:val="28"/>
-          <w:lang w:val="es-419"/>
-        </w:rPr>
-        <w:t>Política de calidad</w:t>
-      </w:r>
-      <w:r>
-        <w:rPr>
-          <w:rFonts w:ascii="Calibri" w:hAnsi="Calibri" w:cs="Calibri"/>
-          <w:szCs w:val="28"/>
-          <w:lang w:val="es-419"/>
-        </w:rPr>
-        <w:t>: d</w:t>
-      </w:r>
-      <w:r>
-        <w:rPr>
-          <w:rFonts w:ascii="Calibri" w:hAnsi="Calibri" w:cs="Calibri"/>
-          <w:szCs w:val="28"/>
-          <w:lang w:val="es-419"/>
-        </w:rPr>
-        <w:t>eclaración formal de las intenciones y directrices de la organización en materia de calidad, definida por la alta dirección y alineada con la política corporativa.</w:t>
-      </w:r>
-    </w:p>
-    <w:p>
-      <w:pPr>
-        <w:rPr>
-          <w:rFonts w:ascii="Calibri" w:hAnsi="Calibri" w:cs="Calibri"/>
-          <w:szCs w:val="28"/>
-          <w:lang w:val="es-419"/>
-        </w:rPr>
-      </w:pPr>
-      <w:r>
-        <w:rPr>
-          <w:rFonts w:ascii="Calibri" w:hAnsi="Calibri" w:cs="Calibri"/>
-          <w:b/>
-          <w:bCs/>
-          <w:szCs w:val="28"/>
-          <w:lang w:val="es-419"/>
-        </w:rPr>
-        <w:t>Portafolio de servicios</w:t>
-      </w:r>
-      <w:r>
-        <w:rPr>
-          <w:rFonts w:ascii="Calibri" w:hAnsi="Calibri" w:cs="Calibri"/>
-          <w:szCs w:val="28"/>
-          <w:lang w:val="es-419"/>
-        </w:rPr>
-        <w:t>: c</w:t>
-      </w:r>
-      <w:r>
-        <w:rPr>
-          <w:rFonts w:ascii="Calibri" w:hAnsi="Calibri" w:cs="Calibri"/>
-          <w:szCs w:val="28"/>
-          <w:lang w:val="es-419"/>
-        </w:rPr>
-        <w:t>onjunto organizado de servicios básicos y complementarios que ofrece el establecimiento de alojamiento a sus clientes.</w:t>
-      </w:r>
-    </w:p>
-    <w:p>
-      <w:pPr>
-        <w:rPr>
-          <w:rFonts w:ascii="Calibri" w:hAnsi="Calibri" w:cs="Calibri"/>
-          <w:szCs w:val="28"/>
-          <w:lang w:val="es-419"/>
-        </w:rPr>
-      </w:pPr>
-      <w:r>
-        <w:rPr>
-          <w:rFonts w:ascii="Calibri" w:hAnsi="Calibri" w:cs="Calibri"/>
-          <w:b/>
-          <w:bCs/>
-          <w:szCs w:val="28"/>
-          <w:lang w:val="es-419"/>
-        </w:rPr>
-        <w:t>Procedimiento técnico</w:t>
-      </w:r>
-      <w:r>
-        <w:rPr>
-          <w:rFonts w:ascii="Calibri" w:hAnsi="Calibri" w:cs="Calibri"/>
-          <w:szCs w:val="28"/>
-          <w:lang w:val="es-419"/>
-        </w:rPr>
-        <w:t>: s</w:t>
-      </w:r>
-      <w:r>
-        <w:rPr>
-          <w:rFonts w:ascii="Calibri" w:hAnsi="Calibri" w:cs="Calibri"/>
-          <w:szCs w:val="28"/>
-          <w:lang w:val="es-419"/>
-        </w:rPr>
-        <w:t>ecuencia estandarizada de actividades que permite ejecutar un proceso operativo de manera ordenada, eficiente y conforme a normas establecidas.</w:t>
-      </w:r>
-    </w:p>
-    <w:p>
-      <w:pPr>
-        <w:rPr>
-          <w:rFonts w:ascii="Calibri" w:hAnsi="Calibri" w:cs="Calibri"/>
-          <w:szCs w:val="28"/>
-          <w:lang w:val="es-419"/>
-        </w:rPr>
-      </w:pPr>
-      <w:r>
-        <w:rPr>
-          <w:rFonts w:ascii="Calibri" w:hAnsi="Calibri" w:cs="Calibri"/>
-          <w:b/>
-          <w:bCs/>
-          <w:szCs w:val="28"/>
-          <w:lang w:val="es-419"/>
-        </w:rPr>
-        <w:t>Programa de mantenimiento</w:t>
-      </w:r>
-      <w:r>
-        <w:rPr>
-          <w:rFonts w:ascii="Calibri" w:hAnsi="Calibri" w:cs="Calibri"/>
-          <w:szCs w:val="28"/>
-          <w:lang w:val="es-419"/>
-        </w:rPr>
-        <w:t>: p</w:t>
-      </w:r>
-      <w:r>
-        <w:rPr>
-          <w:rFonts w:ascii="Calibri" w:hAnsi="Calibri" w:cs="Calibri"/>
-          <w:szCs w:val="28"/>
-          <w:lang w:val="es-419"/>
-        </w:rPr>
-        <w:t>lanificación de actividades de mantenimiento preventivo y correctivo de las instalaciones físicas durante un periodo determinado.</w:t>
-      </w:r>
-    </w:p>
-    <w:p>
-      <w:pPr>
-        <w:rPr>
-          <w:rFonts w:ascii="Calibri" w:hAnsi="Calibri" w:cs="Calibri"/>
-          <w:szCs w:val="28"/>
-          <w:lang w:val="es-419"/>
-        </w:rPr>
-      </w:pPr>
-      <w:r>
-        <w:rPr>
-          <w:rFonts w:ascii="Calibri" w:hAnsi="Calibri" w:cs="Calibri"/>
-          <w:b/>
-          <w:bCs/>
-          <w:szCs w:val="28"/>
-          <w:lang w:val="es-419"/>
-        </w:rPr>
-        <w:t>Protocolo de atención al cliente</w:t>
-      </w:r>
-      <w:r>
-        <w:rPr>
-          <w:rFonts w:ascii="Calibri" w:hAnsi="Calibri" w:cs="Calibri"/>
-          <w:szCs w:val="28"/>
-          <w:lang w:val="es-419"/>
-        </w:rPr>
-        <w:t>: l</w:t>
-      </w:r>
-      <w:r>
-        <w:rPr>
-          <w:rFonts w:ascii="Calibri" w:hAnsi="Calibri" w:cs="Calibri"/>
-          <w:szCs w:val="28"/>
-          <w:lang w:val="es-419"/>
-        </w:rPr>
-        <w:t>ineamientos que orientan la conducta, la comunicación y el servicio del personal hacia el huésped, asegurando atención uniforme y de calidad.</w:t>
-      </w:r>
-    </w:p>
-    <w:p>
-      <w:pPr>
-        <w:rPr>
-          <w:rFonts w:ascii="Calibri" w:hAnsi="Calibri" w:cs="Calibri"/>
-          <w:szCs w:val="28"/>
-          <w:lang w:val="es-419"/>
-        </w:rPr>
-      </w:pPr>
-      <w:r>
-        <w:rPr>
-          <w:rFonts w:ascii="Calibri" w:hAnsi="Calibri" w:cs="Calibri"/>
-          <w:b/>
-          <w:bCs/>
-          <w:szCs w:val="28"/>
-          <w:lang w:val="es-419"/>
-        </w:rPr>
-        <w:lastRenderedPageBreak/>
-        <w:t>Recepción</w:t>
-      </w:r>
-      <w:r>
-        <w:rPr>
-          <w:rFonts w:ascii="Calibri" w:hAnsi="Calibri" w:cs="Calibri"/>
-          <w:szCs w:val="28"/>
-          <w:lang w:val="es-419"/>
-        </w:rPr>
-        <w:t>: á</w:t>
-      </w:r>
-      <w:r>
-        <w:rPr>
-          <w:rFonts w:ascii="Calibri" w:hAnsi="Calibri" w:cs="Calibri"/>
-          <w:szCs w:val="28"/>
-          <w:lang w:val="es-419"/>
-        </w:rPr>
-        <w:t>rea estratégica del hotel encargada del registro de huéspedes, la gestión de reservas, la atención al cliente y el control de la información operativa.</w:t>
-      </w:r>
-    </w:p>
-    <w:p>
-      <w:pPr>
-        <w:rPr>
-          <w:rFonts w:ascii="Calibri" w:hAnsi="Calibri" w:cs="Calibri"/>
-          <w:szCs w:val="28"/>
-          <w:lang w:val="es-419"/>
-        </w:rPr>
-      </w:pPr>
-      <w:r>
-        <w:rPr>
-          <w:rFonts w:ascii="Calibri" w:hAnsi="Calibri" w:cs="Calibri"/>
-          <w:b/>
-          <w:bCs/>
-          <w:szCs w:val="28"/>
-          <w:lang w:val="es-419"/>
-        </w:rPr>
-        <w:t>Registros de mantenimiento</w:t>
-      </w:r>
-      <w:r>
-        <w:rPr>
-          <w:rFonts w:ascii="Calibri" w:hAnsi="Calibri" w:cs="Calibri"/>
-          <w:szCs w:val="28"/>
-          <w:lang w:val="es-419"/>
-        </w:rPr>
-        <w:t>: d</w:t>
-      </w:r>
-      <w:r>
-        <w:rPr>
-          <w:rFonts w:ascii="Calibri" w:hAnsi="Calibri" w:cs="Calibri"/>
-          <w:szCs w:val="28"/>
-          <w:lang w:val="es-419"/>
-        </w:rPr>
-        <w:t>ocumentos que evidencian las actividades realizadas y los resultados obtenidos en los procesos de mantenimiento de las instalaciones.</w:t>
-      </w:r>
-    </w:p>
-    <w:p>
-      <w:pPr>
-        <w:rPr>
-          <w:rFonts w:ascii="Calibri" w:hAnsi="Calibri" w:cs="Calibri"/>
-          <w:szCs w:val="28"/>
-          <w:lang w:val="es-419"/>
-        </w:rPr>
-      </w:pPr>
-      <w:r>
-        <w:rPr>
-          <w:rFonts w:ascii="Calibri" w:hAnsi="Calibri" w:cs="Calibri"/>
-          <w:b/>
-          <w:bCs/>
-          <w:szCs w:val="28"/>
-          <w:lang w:val="es-419"/>
-        </w:rPr>
-        <w:t>Reserva garantizada</w:t>
-      </w:r>
-      <w:r>
-        <w:rPr>
-          <w:rFonts w:ascii="Calibri" w:hAnsi="Calibri" w:cs="Calibri"/>
-          <w:szCs w:val="28"/>
-          <w:lang w:val="es-419"/>
-        </w:rPr>
-        <w:t>: e</w:t>
-      </w:r>
-      <w:r>
-        <w:rPr>
-          <w:rFonts w:ascii="Calibri" w:hAnsi="Calibri" w:cs="Calibri"/>
-          <w:szCs w:val="28"/>
-          <w:lang w:val="es-419"/>
-        </w:rPr>
-        <w:t>stado de una reserva que asegura la disponibilidad de la habitación mediante un medio de pago o garantía aceptada por el establecimiento.</w:t>
-      </w:r>
-    </w:p>
-    <w:p>
-      <w:pPr>
-        <w:rPr>
-          <w:rFonts w:ascii="Calibri" w:hAnsi="Calibri" w:cs="Calibri"/>
-          <w:szCs w:val="28"/>
-          <w:lang w:val="es-419"/>
-        </w:rPr>
-      </w:pPr>
-      <w:r>
-        <w:rPr>
-          <w:rFonts w:ascii="Calibri" w:hAnsi="Calibri" w:cs="Calibri"/>
-          <w:b/>
-          <w:bCs/>
-          <w:szCs w:val="28"/>
-          <w:lang w:val="es-419"/>
-        </w:rPr>
-        <w:t>Reserva hotelera</w:t>
-      </w:r>
-      <w:r>
-        <w:rPr>
-          <w:rFonts w:ascii="Calibri" w:hAnsi="Calibri" w:cs="Calibri"/>
-          <w:szCs w:val="28"/>
-          <w:lang w:val="es-419"/>
-        </w:rPr>
-        <w:t>: c</w:t>
-      </w:r>
-      <w:r>
-        <w:rPr>
-          <w:rFonts w:ascii="Calibri" w:hAnsi="Calibri" w:cs="Calibri"/>
-          <w:szCs w:val="28"/>
-          <w:lang w:val="es-419"/>
-        </w:rPr>
-        <w:t>ompromiso mediante el cual el establecimiento retiene una o varias habitaciones para una fecha determinada, bajo condiciones específicas de pago y cancelación.</w:t>
-      </w:r>
-    </w:p>
-    <w:p>
-      <w:pPr>
-        <w:rPr>
-          <w:rFonts w:ascii="Calibri" w:hAnsi="Calibri" w:cs="Calibri"/>
-          <w:szCs w:val="28"/>
-          <w:lang w:val="es-419"/>
-        </w:rPr>
-      </w:pPr>
-      <w:proofErr w:type="spellStart"/>
-      <w:r>
-        <w:rPr>
-          <w:rStyle w:val="Extranjerismo"/>
-          <w:b/>
-          <w:bCs/>
-          <w:lang w:val="es-419"/>
-        </w:rPr>
-        <w:t>Room</w:t>
-      </w:r>
-      <w:proofErr w:type="spellEnd"/>
-      <w:r>
-        <w:rPr>
-          <w:rStyle w:val="Extranjerismo"/>
-          <w:b/>
-          <w:bCs/>
-          <w:lang w:val="es-419"/>
-        </w:rPr>
-        <w:t xml:space="preserve"> </w:t>
-      </w:r>
-      <w:proofErr w:type="spellStart"/>
-      <w:r>
-        <w:rPr>
-          <w:rStyle w:val="Extranjerismo"/>
-          <w:b/>
-          <w:bCs/>
-          <w:lang w:val="es-419"/>
-        </w:rPr>
-        <w:t>service</w:t>
-      </w:r>
-      <w:proofErr w:type="spellEnd"/>
-      <w:r>
-        <w:rPr>
-          <w:rFonts w:ascii="Calibri" w:hAnsi="Calibri" w:cs="Calibri"/>
-          <w:szCs w:val="28"/>
-          <w:lang w:val="es-419"/>
-        </w:rPr>
-        <w:t>: s</w:t>
-      </w:r>
-      <w:r>
-        <w:rPr>
-          <w:rFonts w:ascii="Calibri" w:hAnsi="Calibri" w:cs="Calibri"/>
-          <w:szCs w:val="28"/>
-          <w:lang w:val="es-419"/>
-        </w:rPr>
-        <w:t>ervicio de alimentación proporcionado directamente en la habitación del huésped.</w:t>
-      </w:r>
-    </w:p>
-    <w:p>
-      <w:pPr>
-        <w:rPr>
-          <w:rFonts w:ascii="Calibri" w:hAnsi="Calibri" w:cs="Calibri"/>
-          <w:szCs w:val="28"/>
-          <w:lang w:val="es-419"/>
-        </w:rPr>
-      </w:pPr>
-      <w:r>
-        <w:rPr>
-          <w:rFonts w:ascii="Calibri" w:hAnsi="Calibri" w:cs="Calibri"/>
-          <w:b/>
-          <w:bCs/>
-          <w:szCs w:val="28"/>
-          <w:lang w:val="es-419"/>
-        </w:rPr>
-        <w:t>Señalización</w:t>
-      </w:r>
-      <w:r>
-        <w:rPr>
-          <w:rFonts w:ascii="Calibri" w:hAnsi="Calibri" w:cs="Calibri"/>
-          <w:szCs w:val="28"/>
-          <w:lang w:val="es-419"/>
-        </w:rPr>
-        <w:t>: c</w:t>
-      </w:r>
-      <w:r>
-        <w:rPr>
-          <w:rFonts w:ascii="Calibri" w:hAnsi="Calibri" w:cs="Calibri"/>
-          <w:szCs w:val="28"/>
-          <w:lang w:val="es-419"/>
-        </w:rPr>
-        <w:t>onjunto de indicaciones visuales que orientan y regulan el comportamiento de las personas dentro del establecimiento.</w:t>
-      </w:r>
-    </w:p>
-    <w:p>
-      <w:pPr>
-        <w:rPr>
-          <w:rFonts w:ascii="Calibri" w:hAnsi="Calibri" w:cs="Calibri"/>
-          <w:szCs w:val="28"/>
-          <w:lang w:val="es-419"/>
-        </w:rPr>
-      </w:pPr>
-      <w:r>
-        <w:rPr>
-          <w:rStyle w:val="Extranjerismo"/>
-          <w:b/>
-          <w:bCs/>
-          <w:lang w:val="es-419"/>
-        </w:rPr>
-        <w:t>Spa</w:t>
-      </w:r>
-      <w:r>
-        <w:rPr>
-          <w:rStyle w:val="Extranjerismo"/>
-          <w:b/>
-          <w:bCs/>
-        </w:rPr>
-        <w:t>:</w:t>
-      </w:r>
-      <w:r>
-        <w:rPr>
-          <w:rFonts w:ascii="Calibri" w:hAnsi="Calibri" w:cs="Calibri"/>
-          <w:szCs w:val="28"/>
-          <w:lang w:val="es-419"/>
-        </w:rPr>
-        <w:t xml:space="preserve"> i</w:t>
-      </w:r>
-      <w:r>
-        <w:rPr>
-          <w:rFonts w:ascii="Calibri" w:hAnsi="Calibri" w:cs="Calibri"/>
-          <w:szCs w:val="28"/>
-          <w:lang w:val="es-419"/>
-        </w:rPr>
-        <w:t>nfraestructura destinada al bienestar físico y mental, que utiliza elementos naturales o tratamientos especializados como servicio complementario del hotel.</w:t>
-      </w:r>
-    </w:p>
-    <w:p>
-      <w:pPr>
-        <w:rPr>
-          <w:rFonts w:ascii="Calibri" w:hAnsi="Calibri" w:cs="Calibri"/>
-          <w:szCs w:val="28"/>
-          <w:lang w:val="es-419"/>
-        </w:rPr>
-      </w:pPr>
-      <w:r>
-        <w:rPr>
-          <w:rFonts w:ascii="Calibri" w:hAnsi="Calibri" w:cs="Calibri"/>
-          <w:b/>
-          <w:bCs/>
-          <w:szCs w:val="28"/>
-          <w:lang w:val="es-419"/>
-        </w:rPr>
-        <w:t>Tarifa hotelera</w:t>
-      </w:r>
-      <w:r>
-        <w:rPr>
-          <w:rFonts w:ascii="Calibri" w:hAnsi="Calibri" w:cs="Calibri"/>
-          <w:szCs w:val="28"/>
-          <w:lang w:val="es-419"/>
-        </w:rPr>
-        <w:t>: v</w:t>
-      </w:r>
-      <w:r>
-        <w:rPr>
-          <w:rFonts w:ascii="Calibri" w:hAnsi="Calibri" w:cs="Calibri"/>
-          <w:szCs w:val="28"/>
-          <w:lang w:val="es-419"/>
-        </w:rPr>
-        <w:t>alor económico asignado a los servicios de alojamiento y complementarios, definido según políticas internas, temporada y tipo de cliente.</w:t>
-      </w:r>
-    </w:p>
-    <w:p>
-      <w:pPr>
-        <w:rPr>
-          <w:rFonts w:ascii="Calibri" w:hAnsi="Calibri" w:cs="Calibri"/>
-          <w:szCs w:val="28"/>
-          <w:lang w:val="es-419"/>
-        </w:rPr>
-      </w:pPr>
-      <w:r>
-        <w:rPr>
-          <w:rFonts w:ascii="Calibri" w:hAnsi="Calibri" w:cs="Calibri"/>
-          <w:b/>
-          <w:bCs/>
-          <w:szCs w:val="28"/>
-          <w:lang w:val="es-419"/>
-        </w:rPr>
-        <w:t>Tipología de habitaciones</w:t>
-      </w:r>
-      <w:r>
-        <w:rPr>
-          <w:rFonts w:ascii="Calibri" w:hAnsi="Calibri" w:cs="Calibri"/>
-          <w:szCs w:val="28"/>
-          <w:lang w:val="es-419"/>
-        </w:rPr>
-        <w:t>: c</w:t>
-      </w:r>
-      <w:r>
-        <w:rPr>
-          <w:rFonts w:ascii="Calibri" w:hAnsi="Calibri" w:cs="Calibri"/>
-          <w:szCs w:val="28"/>
-          <w:lang w:val="es-419"/>
-        </w:rPr>
-        <w:t>lasificación de las habitaciones según características como tamaño, tipo de cama, capacidad y nivel de</w:t>
-      </w:r>
-      <w:r>
-        <w:rPr>
-          <w:rStyle w:val="Extranjerismo"/>
-          <w:lang w:val="es-419"/>
-        </w:rPr>
-        <w:t xml:space="preserve"> confort</w:t>
-      </w:r>
-      <w:r>
-        <w:rPr>
-          <w:rFonts w:ascii="Calibri" w:hAnsi="Calibri" w:cs="Calibri"/>
-          <w:szCs w:val="28"/>
-          <w:lang w:val="es-419"/>
-        </w:rPr>
-        <w:t>.</w:t>
-      </w:r>
-    </w:p>
-    <w:p>
-      <w:pPr>
-        <w:rPr>
-          <w:rFonts w:ascii="Calibri" w:hAnsi="Calibri" w:cs="Calibri"/>
-          <w:szCs w:val="28"/>
-          <w:lang w:val="es-419"/>
-        </w:rPr>
-      </w:pPr>
-      <w:r>
-        <w:rPr>
-          <w:rFonts w:ascii="Calibri" w:hAnsi="Calibri" w:cs="Calibri"/>
-          <w:b/>
-          <w:bCs/>
-          <w:szCs w:val="28"/>
-          <w:lang w:val="es-419"/>
-        </w:rPr>
-        <w:t>Turno operativo</w:t>
-      </w:r>
-      <w:r>
-        <w:rPr>
-          <w:rFonts w:ascii="Calibri" w:hAnsi="Calibri" w:cs="Calibri"/>
-          <w:szCs w:val="28"/>
-          <w:lang w:val="es-419"/>
-        </w:rPr>
-        <w:t>: f</w:t>
-      </w:r>
-      <w:r>
-        <w:rPr>
-          <w:rFonts w:ascii="Calibri" w:hAnsi="Calibri" w:cs="Calibri"/>
-          <w:szCs w:val="28"/>
-          <w:lang w:val="es-419"/>
-        </w:rPr>
-        <w:t>ranja horaria en la cual el personal desarrolla sus funciones, garantizando la continuidad del servicio hotelero.</w:t>
-      </w:r>
-    </w:p>
-    <w:p>
-      <w:pPr>
-        <w:rPr>
-          <w:rFonts w:ascii="Calibri" w:hAnsi="Calibri" w:cs="Calibri"/>
-          <w:szCs w:val="28"/>
-          <w:lang w:val="es-419"/>
-        </w:rPr>
-      </w:pPr>
-      <w:proofErr w:type="spellStart"/>
-      <w:r>
-        <w:rPr>
-          <w:rStyle w:val="Extranjerismo"/>
-          <w:b/>
-          <w:bCs/>
-          <w:lang w:val="es-419"/>
-        </w:rPr>
         <w:lastRenderedPageBreak/>
         <w:t>Upselling</w:t>
       </w:r>
-      <w:proofErr w:type="spellEnd"/>
       <w:r>
         <w:rPr>
           <w:rFonts w:ascii="Calibri" w:hAnsi="Calibri" w:cs="Calibri"/>
@@ -8898,13 +8664,8 @@
       </w:r>
     </w:p>
     <w:p>
-      <w:proofErr w:type="spellStart"/>
-      <w:r>
-        <w:t>Medlik</w:t>
-      </w:r>
-      <w:proofErr w:type="spellEnd"/>
-      <w:r>
-        <w:t xml:space="preserve">, S., &amp; Ingram, H. (2018). </w:t>
+      <w:r>
+        <w:t xml:space="preserve">Medlik, S., &amp; Ingram, H. (2018). </w:t>
       </w:r>
       <w:r>
         <w:rPr>
@@ -8918,15 +8679,7 @@
     </w:p>
     <w:p>
       <w:r>
-        <w:t xml:space="preserve">Ministerio de Comercio, Industria y Turismo (2003). Norma Técnica Sectorial Colombiana, Sena, </w:t>
-      </w:r>
-      <w:proofErr w:type="spellStart"/>
-      <w:r>
-        <w:t>Cotelco</w:t>
-      </w:r>
-      <w:proofErr w:type="spellEnd"/>
-      <w:r>
-        <w:t xml:space="preserve">. </w:t>
+        <w:t xml:space="preserve">Ministerio de Comercio, Industria y Turismo (2003). Norma Técnica Sectorial Colombiana, Sena, Cotelco. </w:t>
       </w:r>
       <w:hyperlink r:id="rId25" w:history="1">
         <w:r>
@@ -13670,6 +13423,30 @@
 </file>
 
 <file path=customXml/item1.xml><?xml version="1.0" encoding="utf-8"?>
+<b:Sources xmlns:b="http://schemas.openxmlformats.org/officeDocument/2006/bibliography" xmlns="http://schemas.openxmlformats.org/officeDocument/2006/bibliography" SelectedStyle="\APASixthEditionOfficeOnline.xsl" StyleName="APA" Version="6"/>
+</file>
+
+<file path=customXml/item2.xml><?xml version="1.0" encoding="utf-8"?>
+<p:properties xmlns:p="http://schemas.microsoft.com/office/2006/metadata/properties" xmlns:xsi="http://www.w3.org/2001/XMLSchema-instance" xmlns:pc="http://schemas.microsoft.com/office/infopath/2007/PartnerControls">
+  <documentManagement>
+    <TaxCatchAll xmlns="13c90a0b-73bc-4dc0-be5f-28d77b615beb" xsi:nil="true"/>
+    <lcf76f155ced4ddcb4097134ff3c332f xmlns="13c93bba-48ce-428c-bfe5-88b42c19b028">
+      <Terms xmlns="http://schemas.microsoft.com/office/infopath/2007/PartnerControls"/>
+    </lcf76f155ced4ddcb4097134ff3c332f>
+  </documentManagement>
+</p:properties>
+</file>
+
+<file path=customXml/item3.xml><?xml version="1.0" encoding="utf-8"?>
+<?mso-contentType ?>
+<FormTemplates xmlns="http://schemas.microsoft.com/sharepoint/v3/contenttype/forms">
+  <Display>DocumentLibraryForm</Display>
+  <Edit>DocumentLibraryForm</Edit>
+  <New>DocumentLibraryForm</New>
+</FormTemplates>
+</file>
+
+<file path=customXml/item4.xml><?xml version="1.0" encoding="utf-8"?>
 <ct:contentTypeSchema xmlns:ct="http://schemas.microsoft.com/office/2006/metadata/contentType" xmlns:ma="http://schemas.microsoft.com/office/2006/metadata/properties/metaAttributes" ct:_="" ma:_="" ma:contentTypeName="Documento" ma:contentTypeID="0x0101006A81D6BD42E8DF4C91013959704817E1" ma:contentTypeVersion="15" ma:contentTypeDescription="Crear nuevo documento." ma:contentTypeScope="" ma:versionID="bf4f72ffd194f0963ff564daca6869f7">
   <xsd:schema xmlns:xsd="http://www.w3.org/2001/XMLSchema" xmlns:xs="http://www.w3.org/2001/XMLSchema" xmlns:p="http://schemas.microsoft.com/office/2006/metadata/properties" xmlns:ns2="13c90a0b-73bc-4dc0-be5f-28d77b615beb" xmlns:ns3="13c93bba-48ce-428c-bfe5-88b42c19b028" targetNamespace="http://schemas.microsoft.com/office/2006/metadata/properties" ma:root="true" ma:fieldsID="8718d6f4873a5b1392a45044efa78385" ns2:_="" ns3:_="">
     <xsd:import namespace="13c90a0b-73bc-4dc0-be5f-28d77b615beb"/>
@@ -13904,31 +13681,34 @@
 </ct:contentTypeSchema>
 </file>
 
-<file path=customXml/item2.xml><?xml version="1.0" encoding="utf-8"?>
-<b:Sources xmlns:b="http://schemas.openxmlformats.org/officeDocument/2006/bibliography" xmlns="http://schemas.openxmlformats.org/officeDocument/2006/bibliography" SelectedStyle="\APASixthEditionOfficeOnline.xsl" StyleName="APA" Version="6"/>
+<file path=customXml/itemProps1.xml><?xml version="1.0" encoding="utf-8"?>
+<ds:datastoreItem xmlns:ds="http://schemas.openxmlformats.org/officeDocument/2006/customXml" ds:itemID="{E8AB44A3-7C62-4BD2-82ED-8ABC209970FA}">
+  <ds:schemaRefs>
+    <ds:schemaRef ds:uri="http://schemas.openxmlformats.org/officeDocument/2006/bibliography"/>
+  </ds:schemaRefs>
+</ds:datastoreItem>
 </file>
 
-<file path=customXml/item3.xml><?xml version="1.0" encoding="utf-8"?>
-<p:properties xmlns:p="http://schemas.microsoft.com/office/2006/metadata/properties" xmlns:xsi="http://www.w3.org/2001/XMLSchema-instance" xmlns:pc="http://schemas.microsoft.com/office/infopath/2007/PartnerControls">
-  <documentManagement>
-    <TaxCatchAll xmlns="13c90a0b-73bc-4dc0-be5f-28d77b615beb" xsi:nil="true"/>
-    <lcf76f155ced4ddcb4097134ff3c332f xmlns="13c93bba-48ce-428c-bfe5-88b42c19b028">
-      <Terms xmlns="http://schemas.microsoft.com/office/infopath/2007/PartnerControls"/>
-    </lcf76f155ced4ddcb4097134ff3c332f>
-  </documentManagement>
-</p:properties>
+<file path=customXml/itemProps2.xml><?xml version="1.0" encoding="utf-8"?>
+<ds:datastoreItem xmlns:ds="http://schemas.openxmlformats.org/officeDocument/2006/customXml" ds:itemID="{1145D752-ACC1-45E1-AB53-0C756F67FC7F}">
+  <ds:schemaRefs>
+    <ds:schemaRef ds:uri="http://schemas.microsoft.com/office/2006/metadata/properties"/>
+    <ds:schemaRef ds:uri="http://schemas.microsoft.com/office/infopath/2007/PartnerControls"/>
+    <ds:schemaRef ds:uri="13c90a0b-73bc-4dc0-be5f-28d77b615beb"/>
+    <ds:schemaRef ds:uri="13c93bba-48ce-428c-bfe5-88b42c19b028"/>
+  </ds:schemaRefs>
+</ds:datastoreItem>
 </file>
 
-<file path=customXml/item4.xml><?xml version="1.0" encoding="utf-8"?>
-<?mso-contentType ?>
-<FormTemplates xmlns="http://schemas.microsoft.com/sharepoint/v3/contenttype/forms">
-  <Display>DocumentLibraryForm</Display>
-  <Edit>DocumentLibraryForm</Edit>
-  <New>DocumentLibraryForm</New>
-</FormTemplates>
+<file path=customXml/itemProps3.xml><?xml version="1.0" encoding="utf-8"?>
+<ds:datastoreItem xmlns:ds="http://schemas.openxmlformats.org/officeDocument/2006/customXml" ds:itemID="{81CBDEC1-3B00-44ED-AD36-0268077980BA}">
+  <ds:schemaRefs>
+    <ds:schemaRef ds:uri="http://schemas.microsoft.com/sharepoint/v3/contenttype/forms"/>
+  </ds:schemaRefs>
+</ds:datastoreItem>
 </file>
 
-<file path=customXml/itemProps1.xml><?xml version="1.0" encoding="utf-8"?>
+<file path=customXml/itemProps4.xml><?xml version="1.0" encoding="utf-8"?>
 <ds:datastoreItem xmlns:ds="http://schemas.openxmlformats.org/officeDocument/2006/customXml" ds:itemID="{7EF31011-AEB4-45D1-BE72-7179C45089B8}">
   <ds:schemaRefs>
     <ds:schemaRef ds:uri="http://schemas.microsoft.com/office/2006/metadata/contentType"/>
@@ -13945,31 +13725,4 @@
     <ds:schemaRef ds:uri="http://schemas.microsoft.com/internal/obd"/>
   </ds:schemaRefs>
 </ds:datastoreItem>
-</file>
-
-<file path=customXml/itemProps2.xml><?xml version="1.0" encoding="utf-8"?>
-<ds:datastoreItem xmlns:ds="http://schemas.openxmlformats.org/officeDocument/2006/customXml" ds:itemID="{E8AB44A3-7C62-4BD2-82ED-8ABC209970FA}">
-  <ds:schemaRefs>
-    <ds:schemaRef ds:uri="http://schemas.openxmlformats.org/officeDocument/2006/bibliography"/>
-  </ds:schemaRefs>
-</ds:datastoreItem>
-</file>
-
-<file path=customXml/itemProps3.xml><?xml version="1.0" encoding="utf-8"?>
-<ds:datastoreItem xmlns:ds="http://schemas.openxmlformats.org/officeDocument/2006/customXml" ds:itemID="{1145D752-ACC1-45E1-AB53-0C756F67FC7F}">
-  <ds:schemaRefs>
-    <ds:schemaRef ds:uri="http://schemas.microsoft.com/office/2006/metadata/properties"/>
-    <ds:schemaRef ds:uri="http://schemas.microsoft.com/office/infopath/2007/PartnerControls"/>
-    <ds:schemaRef ds:uri="13c90a0b-73bc-4dc0-be5f-28d77b615beb"/>
-    <ds:schemaRef ds:uri="13c93bba-48ce-428c-bfe5-88b42c19b028"/>
-  </ds:schemaRefs>
-</ds:datastoreItem>
-</file>
-
-<file path=customXml/itemProps4.xml><?xml version="1.0" encoding="utf-8"?>
-<ds:datastoreItem xmlns:ds="http://schemas.openxmlformats.org/officeDocument/2006/customXml" ds:itemID="{81CBDEC1-3B00-44ED-AD36-0268077980BA}">
-  <ds:schemaRefs>
-    <ds:schemaRef ds:uri="http://schemas.microsoft.com/sharepoint/v3/contenttype/forms"/>
-  </ds:schemaRefs>
-</ds:datastoreItem>
 </file>
</xml_diff>